<commit_message>
style(css): update ~$RADHYA_DEV_TAMRAKAR_CV.docx, verify.yml +28 more - AARADHYA DEV TAMRAKAR (+3625/-2958)
</commit_message>
<xml_diff>
--- a/assets/docs/AARADHYA_DEV_TAMRAKAR_CV.docx
+++ b/assets/docs/AARADHYA_DEV_TAMRAKAR_CV.docx
@@ -1,27 +1,38 @@
 
 <file path=word/document.xml><?xml version="1.0" encoding="utf-8"?>
-<w:document xmlns:wpc="http://schemas.microsoft.com/office/word/2010/wordprocessingCanvas" xmlns:mc="http://schemas.openxmlformats.org/markup-compatibility/2006" xmlns:o="urn:schemas-microsoft-com:office:office" xmlns:r="http://schemas.openxmlformats.org/officeDocument/2006/relationships" xmlns:m="http://schemas.openxmlformats.org/officeDocument/2006/math" xmlns:v="urn:schemas-microsoft-com:vml" xmlns:wp14="http://schemas.microsoft.com/office/word/2010/wordprocessingDrawing" xmlns:wp="http://schemas.openxmlformats.org/drawingml/2006/wordprocessingDrawing" xmlns:w10="urn:schemas-microsoft-com:office:word" xmlns:w="http://schemas.openxmlformats.org/wordprocessingml/2006/main" xmlns:w14="http://schemas.microsoft.com/office/word/2010/wordml" xmlns:w15="http://schemas.microsoft.com/office/word/2012/wordml" xmlns:wpg="http://schemas.microsoft.com/office/word/2010/wordprocessingGroup" xmlns:wpi="http://schemas.microsoft.com/office/word/2010/wordprocessingInk" xmlns:wne="http://schemas.microsoft.com/office/word/2006/wordml" xmlns:wps="http://schemas.microsoft.com/office/word/2010/wordprocessingShape" xmlns:cx="http://schemas.microsoft.com/office/drawing/2014/chartex" xmlns:cx1="http://schemas.microsoft.com/office/drawing/2015/9/8/chartex" xmlns:cx2="http://schemas.microsoft.com/office/drawing/2015/10/21/chartex" xmlns:cx3="http://schemas.microsoft.com/office/drawing/2016/5/9/chartex" xmlns:cx4="http://schemas.microsoft.com/office/drawing/2016/5/10/chartex" xmlns:cx5="http://schemas.microsoft.com/office/drawing/2016/5/11/chartex" xmlns:cx6="http://schemas.microsoft.com/office/drawing/2016/5/12/chartex" xmlns:cx7="http://schemas.microsoft.com/office/drawing/2016/5/13/chartex" xmlns:cx8="http://schemas.microsoft.com/office/drawing/2016/5/14/chartex" xmlns:aink="http://schemas.microsoft.com/office/drawing/2016/ink" xmlns:am3d="http://schemas.microsoft.com/office/drawing/2017/model3d" xmlns:w16cex="http://schemas.microsoft.com/office/word/2018/wordml/cex" xmlns:w16cid="http://schemas.microsoft.com/office/word/2016/wordml/cid" xmlns:w16="http://schemas.microsoft.com/office/word/2018/wordml" xmlns:w16sdtdh="http://schemas.microsoft.com/office/word/2020/wordml/sdtdatahash" xmlns:w16se="http://schemas.microsoft.com/office/word/2015/wordml/symex" mc:Ignorable="w14 w15 wp14">
+<w:document xmlns:wpc="http://schemas.microsoft.com/office/word/2010/wordprocessingCanvas" xmlns:cx="http://schemas.microsoft.com/office/drawing/2014/chartex" xmlns:cx1="http://schemas.microsoft.com/office/drawing/2015/9/8/chartex" xmlns:cx2="http://schemas.microsoft.com/office/drawing/2015/10/21/chartex" xmlns:cx3="http://schemas.microsoft.com/office/drawing/2016/5/9/chartex" xmlns:cx4="http://schemas.microsoft.com/office/drawing/2016/5/10/chartex" xmlns:cx5="http://schemas.microsoft.com/office/drawing/2016/5/11/chartex" xmlns:cx6="http://schemas.microsoft.com/office/drawing/2016/5/12/chartex" xmlns:cx7="http://schemas.microsoft.com/office/drawing/2016/5/13/chartex" xmlns:cx8="http://schemas.microsoft.com/office/drawing/2016/5/14/chartex" xmlns:mc="http://schemas.openxmlformats.org/markup-compatibility/2006" xmlns:aink="http://schemas.microsoft.com/office/drawing/2016/ink" xmlns:am3d="http://schemas.microsoft.com/office/drawing/2017/model3d" xmlns:o="urn:schemas-microsoft-com:office:office" xmlns:r="http://schemas.openxmlformats.org/officeDocument/2006/relationships" xmlns:m="http://schemas.openxmlformats.org/officeDocument/2006/math" xmlns:v="urn:schemas-microsoft-com:vml" xmlns:wp14="http://schemas.microsoft.com/office/word/2010/wordprocessingDrawing" xmlns:wp="http://schemas.openxmlformats.org/drawingml/2006/wordprocessingDrawing" xmlns:w10="urn:schemas-microsoft-com:office:word" xmlns:w="http://schemas.openxmlformats.org/wordprocessingml/2006/main" xmlns:w14="http://schemas.microsoft.com/office/word/2010/wordml" xmlns:w15="http://schemas.microsoft.com/office/word/2012/wordml" xmlns:w16cid="http://schemas.microsoft.com/office/word/2016/wordml/cid" xmlns:w16se="http://schemas.microsoft.com/office/word/2015/wordml/symex" xmlns:wpg="http://schemas.microsoft.com/office/word/2010/wordprocessingGroup" xmlns:wpi="http://schemas.microsoft.com/office/word/2010/wordprocessingInk" xmlns:wne="http://schemas.microsoft.com/office/word/2006/wordml" xmlns:wps="http://schemas.microsoft.com/office/word/2010/wordprocessingShape" mc:Ignorable="w14 w15 w16se w16cid wp14">
   <w:body>
     <w:tbl>
       <w:tblPr>
-        <w:tblW w:type="pct" w:w="100%"/>
+        <w:tblW w:w="5000" w:type="pct"/>
         <w:tblBorders>
-          <w:top w:val="none" w:color="FFFFFF" w:sz="0"/>
-          <w:left w:val="none" w:color="FFFFFF" w:sz="0"/>
-          <w:bottom w:val="none" w:color="FFFFFF" w:sz="0"/>
-          <w:right w:val="none" w:color="FFFFFF" w:sz="0"/>
-          <w:insideH w:val="none" w:color="FFFFFF" w:sz="0"/>
-          <w:insideV w:val="none" w:color="FFFFFF" w:sz="0"/>
+          <w:top w:val="none" w:sz="0" w:space="0" w:color="FFFFFF"/>
+          <w:left w:val="none" w:sz="0" w:space="0" w:color="FFFFFF"/>
+          <w:bottom w:val="none" w:sz="0" w:space="0" w:color="FFFFFF"/>
+          <w:right w:val="none" w:sz="0" w:space="0" w:color="FFFFFF"/>
+          <w:insideH w:val="none" w:sz="0" w:space="0" w:color="FFFFFF"/>
+          <w:insideV w:val="none" w:sz="0" w:space="0" w:color="FFFFFF"/>
         </w:tblBorders>
+        <w:tblCellMar>
+          <w:left w:w="10" w:type="dxa"/>
+          <w:right w:w="10" w:type="dxa"/>
+        </w:tblCellMar>
+        <w:tblLook w:val="04A0" w:firstRow="1" w:lastRow="0" w:firstColumn="1" w:lastColumn="0" w:noHBand="0" w:noVBand="1"/>
       </w:tblPr>
       <w:tblGrid>
-        <w:gridCol w:w="100"/>
-        <w:gridCol w:w="100"/>
+        <w:gridCol w:w="8746"/>
+        <w:gridCol w:w="1920"/>
       </w:tblGrid>
       <w:tr>
+        <w:tblPrEx>
+          <w:tblCellMar>
+            <w:top w:w="0" w:type="dxa"/>
+            <w:bottom w:w="0" w:type="dxa"/>
+          </w:tblCellMar>
+        </w:tblPrEx>
         <w:tc>
           <w:tcPr>
-            <w:tcW w:type="pct" w:w="82%"/>
+            <w:tcW w:w="4100" w:type="pct"/>
             <w:vAlign w:val="center"/>
           </w:tcPr>
           <w:p>
@@ -36,13 +47,10 @@
                 <w:sz w:val="32"/>
                 <w:szCs w:val="32"/>
               </w:rPr>
-              <w:t xml:space="preserve">AARADHYA DEV TAMRAKAR</w:t>
+              <w:t>AARADHYA DEV TAMRAKAR</w:t>
             </w:r>
           </w:p>
           <w:p>
-            <w:pPr>
-              <w:spacing w:after="0"/>
-            </w:pPr>
             <w:r>
               <w:rPr>
                 <w:sz w:val="18"/>
@@ -50,7 +58,7 @@
               </w:rPr>
               <w:t xml:space="preserve">Kathmandu, Nepal  •  aaradhyadevtmr@gmail.com  •  +977 9844602050  •  </w:t>
             </w:r>
-            <w:hyperlink w:history="1" r:id="rIdl-zd8qsftdninfyyveuue">
+            <w:hyperlink r:id="rId5" w:history="1">
               <w:r>
                 <w:rPr>
                   <w:color w:val="1F3864"/>
@@ -58,8 +66,39 @@
                   <w:szCs w:val="18"/>
                   <w:u w:val="single"/>
                 </w:rPr>
-                <w:t xml:space="preserve">linkedin.com/in/aaradhya-dev-tamrakar</w:t>
+                <w:t>linkedin.com/in/</w:t>
               </w:r>
+              <w:proofErr w:type="spellStart"/>
+              <w:r>
+                <w:rPr>
+                  <w:color w:val="1F3864"/>
+                  <w:sz w:val="18"/>
+                  <w:szCs w:val="18"/>
+                  <w:u w:val="single"/>
+                </w:rPr>
+                <w:t>aaradhya</w:t>
+              </w:r>
+              <w:proofErr w:type="spellEnd"/>
+              <w:r>
+                <w:rPr>
+                  <w:color w:val="1F3864"/>
+                  <w:sz w:val="18"/>
+                  <w:szCs w:val="18"/>
+                  <w:u w:val="single"/>
+                </w:rPr>
+                <w:t>-dev-</w:t>
+              </w:r>
+              <w:proofErr w:type="spellStart"/>
+              <w:r>
+                <w:rPr>
+                  <w:color w:val="1F3864"/>
+                  <w:sz w:val="18"/>
+                  <w:szCs w:val="18"/>
+                  <w:u w:val="single"/>
+                </w:rPr>
+                <w:t>tamrakar</w:t>
+              </w:r>
+              <w:proofErr w:type="spellEnd"/>
             </w:hyperlink>
             <w:r>
               <w:rPr>
@@ -68,7 +107,7 @@
               </w:rPr>
               <w:t xml:space="preserve">  •  </w:t>
             </w:r>
-            <w:hyperlink w:history="1" r:id="rId0qqgfyoc2vejlzwfqomi1">
+            <w:hyperlink r:id="rId6" w:history="1">
               <w:r>
                 <w:rPr>
                   <w:color w:val="1F3864"/>
@@ -76,8 +115,19 @@
                   <w:szCs w:val="18"/>
                   <w:u w:val="single"/>
                 </w:rPr>
-                <w:t xml:space="preserve">github.com/AaradhyaDT</w:t>
+                <w:t>github.com/</w:t>
               </w:r>
+              <w:proofErr w:type="spellStart"/>
+              <w:r>
+                <w:rPr>
+                  <w:color w:val="1F3864"/>
+                  <w:sz w:val="18"/>
+                  <w:szCs w:val="18"/>
+                  <w:u w:val="single"/>
+                </w:rPr>
+                <w:t>AaradhyaDT</w:t>
+              </w:r>
+              <w:proofErr w:type="spellEnd"/>
             </w:hyperlink>
             <w:r>
               <w:rPr>
@@ -86,7 +136,7 @@
               </w:rPr>
               <w:t xml:space="preserve">  •  </w:t>
             </w:r>
-            <w:hyperlink w:history="1" r:id="rId7dzf2u9qx3assn6jqv_-d">
+            <w:hyperlink r:id="rId7" w:history="1">
               <w:r>
                 <w:rPr>
                   <w:color w:val="1F3864"/>
@@ -94,14 +144,32 @@
                   <w:szCs w:val="18"/>
                   <w:u w:val="single"/>
                 </w:rPr>
-                <w:t xml:space="preserve">aaradhya-dev-tamrakar.github.io</w:t>
+                <w:t>aaradhya</w:t>
+              </w:r>
+              <w:r>
+                <w:rPr>
+                  <w:color w:val="1F3864"/>
+                  <w:sz w:val="18"/>
+                  <w:szCs w:val="18"/>
+                  <w:u w:val="single"/>
+                </w:rPr>
+                <w:t>dt</w:t>
+              </w:r>
+              <w:r>
+                <w:rPr>
+                  <w:color w:val="1F3864"/>
+                  <w:sz w:val="18"/>
+                  <w:szCs w:val="18"/>
+                  <w:u w:val="single"/>
+                </w:rPr>
+                <w:t>.github.io</w:t>
               </w:r>
             </w:hyperlink>
           </w:p>
         </w:tc>
         <w:tc>
           <w:tcPr>
-            <w:tcW w:type="pct" w:w="18%"/>
+            <w:tcW w:w="900" w:type="pct"/>
             <w:vAlign w:val="center"/>
           </w:tcPr>
           <w:p>
@@ -109,11 +177,14 @@
               <w:jc w:val="right"/>
             </w:pPr>
             <w:r>
+              <w:rPr>
+                <w:noProof/>
+              </w:rPr>
               <w:drawing>
-                <wp:inline distT="0" distB="0" distL="0" distR="0">
+                <wp:inline distT="0" distB="0" distL="0" distR="0" wp14:anchorId="638DF803" wp14:editId="587072A4">
                   <wp:extent cx="666750" cy="666750"/>
-                  <wp:effectExtent t="0" r="0" b="0" l="0"/>
-                  <wp:docPr id="1" name="" descr="" title=""/>
+                  <wp:effectExtent l="0" t="0" r="0" b="0"/>
+                  <wp:docPr id="1" name="Picture 1"/>
                   <wp:cNvGraphicFramePr>
                     <a:graphicFrameLocks xmlns:a="http://schemas.openxmlformats.org/drawingml/2006/main" noChangeAspect="1"/>
                   </wp:cNvGraphicFramePr>
@@ -121,13 +192,13 @@
                     <a:graphicData uri="http://schemas.openxmlformats.org/drawingml/2006/picture">
                       <pic:pic xmlns:pic="http://schemas.openxmlformats.org/drawingml/2006/picture">
                         <pic:nvPicPr>
-                          <pic:cNvPr id="0" name="" descr=""/>
+                          <pic:cNvPr id="0" name=""/>
                           <pic:cNvPicPr>
                             <a:picLocks noChangeAspect="1" noChangeArrowheads="1"/>
                           </pic:cNvPicPr>
                         </pic:nvPicPr>
                         <pic:blipFill>
-                          <a:blip r:embed="rId7" cstate="none"/>
+                          <a:blip r:embed="rId8"/>
                           <a:srcRect/>
                           <a:stretch>
                             <a:fillRect/>
@@ -156,13 +227,15 @@
       <w:pPr>
         <w:spacing w:after="100"/>
       </w:pPr>
+      <w:bookmarkStart w:id="0" w:name="_GoBack"/>
+      <w:bookmarkEnd w:id="0"/>
     </w:p>
     <w:p>
       <w:pPr>
         <w:pBdr>
-          <w:bottom w:val="single" w:color="1F3864" w:sz="6" w:space="2"/>
+          <w:bottom w:val="single" w:sz="6" w:space="2" w:color="1F3864"/>
         </w:pBdr>
-        <w:spacing w:after="100" w:before="260"/>
+        <w:spacing w:before="260" w:after="100"/>
       </w:pPr>
       <w:r>
         <w:rPr>
@@ -173,7 +246,7 @@
           <w:sz w:val="22"/>
           <w:szCs w:val="22"/>
         </w:rPr>
-        <w:t xml:space="preserve">PROFILE</w:t>
+        <w:t>PROFILE</w:t>
       </w:r>
     </w:p>
     <w:p>
@@ -181,19 +254,37 @@
         <w:spacing w:after="120"/>
       </w:pPr>
       <w:r>
-        <w:rPr>
-          <w:sz w:val="20"/>
-          <w:szCs w:val="20"/>
-        </w:rPr>
-        <w:t xml:space="preserve">Electronics, Communication and Information student at IOE, Kathmandu Engineering College (Year IV/I). Builds ML pipelines spanning classification, regression, tree-based ensembles, and agentic Text-to-SQL systems; deploys via FastAPI and Docker; develops Android apps with Kotlin/Jetpack Compose. Advancing through the Fusemachines AI Fellowship and NSSR DataCamp Fellowship, while leading SPARK, an ESP32-S3 edge-AI wearable fall-detection system.</w:t>
+        <w:t>Electronics, Communication and Information student at IOE, Kathmandu Engineering College (Year IV/I). Builds ML pipelines spanning</w:t>
+      </w:r>
+      <w:r>
+        <w:t xml:space="preserve"> classification, regression, tree-based ensembles, and agentic Text-to-SQL systems; deploys via FastAPI and Docker; develops Android apps with Kotlin/Jetpack Compose. Advancing through the </w:t>
+      </w:r>
+      <w:proofErr w:type="spellStart"/>
+      <w:r>
+        <w:t>Fusemachines</w:t>
+      </w:r>
+      <w:proofErr w:type="spellEnd"/>
+      <w:r>
+        <w:t xml:space="preserve"> AI Fellowship and NSSR </w:t>
+      </w:r>
+      <w:proofErr w:type="spellStart"/>
+      <w:r>
+        <w:t>DataCamp</w:t>
+      </w:r>
+      <w:proofErr w:type="spellEnd"/>
+      <w:r>
+        <w:t xml:space="preserve"> Fellowship, while lead</w:t>
+      </w:r>
+      <w:r>
+        <w:t>ing SPARK, an ESP32-S3 edge-AI wearable fall-detection system.</w:t>
       </w:r>
     </w:p>
     <w:p>
       <w:pPr>
         <w:pBdr>
-          <w:bottom w:val="single" w:color="1F3864" w:sz="6" w:space="2"/>
+          <w:bottom w:val="single" w:sz="6" w:space="2" w:color="1F3864"/>
         </w:pBdr>
-        <w:spacing w:after="100" w:before="260"/>
+        <w:spacing w:before="260" w:after="100"/>
       </w:pPr>
       <w:r>
         <w:rPr>
@@ -204,7 +295,7 @@
           <w:sz w:val="22"/>
           <w:szCs w:val="22"/>
         </w:rPr>
-        <w:t xml:space="preserve">EDUCATION</w:t>
+        <w:t>EDUCATION</w:t>
       </w:r>
     </w:p>
     <w:p>
@@ -212,7 +303,7 @@
         <w:tabs>
           <w:tab w:val="right" w:pos="10080"/>
         </w:tabs>
-        <w:spacing w:after="20" w:before="160"/>
+        <w:spacing w:before="160" w:after="20"/>
       </w:pPr>
       <w:r>
         <w:rPr>
@@ -221,17 +312,16 @@
           <w:sz w:val="21"/>
           <w:szCs w:val="21"/>
         </w:rPr>
-        <w:t xml:space="preserve">Bachelor of Engineering (B.E.)</w:t>
-      </w:r>
-      <w:r>
-        <w:rPr>
-          <w:i/>
-          <w:iCs/>
-          <w:color w:val="333333"/>
-          <w:sz w:val="20"/>
-          <w:szCs w:val="20"/>
-        </w:rPr>
-        <w:t xml:space="preserve">	Expected: January 2027</w:t>
+        <w:t>Bachelor of Engineering (B.E.)</w:t>
+      </w:r>
+      <w:r>
+        <w:rPr>
+          <w:i/>
+          <w:iCs/>
+          <w:color w:val="333333"/>
+        </w:rPr>
+        <w:tab/>
+        <w:t>Expected: January 2027</w:t>
       </w:r>
     </w:p>
     <w:p>
@@ -243,10 +333,8 @@
           <w:i/>
           <w:iCs/>
           <w:color w:val="333333"/>
-          <w:sz w:val="20"/>
-          <w:szCs w:val="20"/>
-        </w:rPr>
-        <w:t xml:space="preserve">Electronics, Communication and Information — Institute of Engineering (IOE), Kathmandu Engineering College | Year IV / Part I</w:t>
+        </w:rPr>
+        <w:t>Electronics, Communication and Information — Institute of Engineering (IOE), Kathmandu Engineering College | Year IV / Part I</w:t>
       </w:r>
     </w:p>
     <w:p>
@@ -257,25 +345,26 @@
         <w:rPr>
           <w:b/>
           <w:bCs/>
-          <w:sz w:val="20"/>
-          <w:szCs w:val="20"/>
-        </w:rPr>
-        <w:t xml:space="preserve">Coursework: </w:t>
-      </w:r>
-      <w:r>
-        <w:rPr>
-          <w:sz w:val="20"/>
-          <w:szCs w:val="20"/>
-        </w:rPr>
-        <w:t xml:space="preserve">Machine Learning · Signals and Systems · Digital Electronics · Control Systems · Communication Systems</w:t>
+        </w:rPr>
+        <w:t>Cou</w:t>
+      </w:r>
+      <w:r>
+        <w:rPr>
+          <w:b/>
+          <w:bCs/>
+        </w:rPr>
+        <w:t xml:space="preserve">rsework: </w:t>
+      </w:r>
+      <w:r>
+        <w:t>Machine Learning · Signals and Systems · Digital Electronics · Control Systems · Communication Systems</w:t>
       </w:r>
     </w:p>
     <w:p>
       <w:pPr>
         <w:pBdr>
-          <w:bottom w:val="single" w:color="1F3864" w:sz="6" w:space="2"/>
+          <w:bottom w:val="single" w:sz="6" w:space="2" w:color="1F3864"/>
         </w:pBdr>
-        <w:spacing w:after="100" w:before="260"/>
+        <w:spacing w:before="260" w:after="100"/>
       </w:pPr>
       <w:r>
         <w:rPr>
@@ -286,7 +375,7 @@
           <w:sz w:val="22"/>
           <w:szCs w:val="22"/>
         </w:rPr>
-        <w:t xml:space="preserve">EXPERIENCE</w:t>
+        <w:t>EXPERIENCE</w:t>
       </w:r>
     </w:p>
     <w:p>
@@ -294,7 +383,7 @@
         <w:tabs>
           <w:tab w:val="right" w:pos="10080"/>
         </w:tabs>
-        <w:spacing w:after="20" w:before="160"/>
+        <w:spacing w:before="160" w:after="20"/>
       </w:pPr>
       <w:r>
         <w:rPr>
@@ -303,17 +392,16 @@
           <w:sz w:val="21"/>
           <w:szCs w:val="21"/>
         </w:rPr>
-        <w:t xml:space="preserve">Vice Chair</w:t>
-      </w:r>
-      <w:r>
-        <w:rPr>
-          <w:i/>
-          <w:iCs/>
-          <w:color w:val="333333"/>
-          <w:sz w:val="20"/>
-          <w:szCs w:val="20"/>
-        </w:rPr>
-        <w:t xml:space="preserve">	2026 – Present</w:t>
+        <w:t>Vice Chair</w:t>
+      </w:r>
+      <w:r>
+        <w:rPr>
+          <w:i/>
+          <w:iCs/>
+          <w:color w:val="333333"/>
+        </w:rPr>
+        <w:tab/>
+        <w:t>2026 – Present</w:t>
       </w:r>
     </w:p>
     <w:p>
@@ -325,10 +413,8 @@
           <w:i/>
           <w:iCs/>
           <w:color w:val="333333"/>
-          <w:sz w:val="20"/>
-          <w:szCs w:val="20"/>
-        </w:rPr>
-        <w:t xml:space="preserve">IEEE KEC KTM Student Branch</w:t>
+        </w:rPr>
+        <w:t>IEEE KEC KTM Student Branch</w:t>
       </w:r>
     </w:p>
     <w:p>
@@ -341,11 +427,7 @@
         <w:spacing w:after="40"/>
       </w:pPr>
       <w:r>
-        <w:rPr>
-          <w:sz w:val="20"/>
-          <w:szCs w:val="20"/>
-        </w:rPr>
-        <w:t xml:space="preserve">Directed branch strategy, scaling initiatives and member engagement across executive committees.</w:t>
+        <w:t>Directed branch strategy, scaling initiatives and member engagement across executive committees.</w:t>
       </w:r>
     </w:p>
     <w:p>
@@ -358,11 +440,7 @@
         <w:spacing w:after="40"/>
       </w:pPr>
       <w:r>
-        <w:rPr>
-          <w:sz w:val="20"/>
-          <w:szCs w:val="20"/>
-        </w:rPr>
-        <w:t xml:space="preserve">Managed relations across the broader technical community.</w:t>
+        <w:t>Managed relations across the broader technical community.</w:t>
       </w:r>
     </w:p>
     <w:p>
@@ -370,7 +448,7 @@
         <w:tabs>
           <w:tab w:val="right" w:pos="10080"/>
         </w:tabs>
-        <w:spacing w:after="20" w:before="160"/>
+        <w:spacing w:before="160" w:after="20"/>
       </w:pPr>
       <w:r>
         <w:rPr>
@@ -379,17 +457,16 @@
           <w:sz w:val="21"/>
           <w:szCs w:val="21"/>
         </w:rPr>
-        <w:t xml:space="preserve">Event Manager</w:t>
-      </w:r>
-      <w:r>
-        <w:rPr>
-          <w:i/>
-          <w:iCs/>
-          <w:color w:val="333333"/>
-          <w:sz w:val="20"/>
-          <w:szCs w:val="20"/>
-        </w:rPr>
-        <w:t xml:space="preserve">	2026 – Present</w:t>
+        <w:t>Event Manager</w:t>
+      </w:r>
+      <w:r>
+        <w:rPr>
+          <w:i/>
+          <w:iCs/>
+          <w:color w:val="333333"/>
+        </w:rPr>
+        <w:tab/>
+        <w:t>2026 – Present</w:t>
       </w:r>
     </w:p>
     <w:p>
@@ -401,10 +478,8 @@
           <w:i/>
           <w:iCs/>
           <w:color w:val="333333"/>
-          <w:sz w:val="20"/>
-          <w:szCs w:val="20"/>
-        </w:rPr>
-        <w:t xml:space="preserve">Electronics Project Club (EPC), Kathmandu Engineering College</w:t>
+        </w:rPr>
+        <w:t>Electronics Project Club (EPC), Kathmandu Engineering College</w:t>
       </w:r>
     </w:p>
     <w:p>
@@ -417,11 +492,10 @@
         <w:spacing w:after="40"/>
       </w:pPr>
       <w:r>
-        <w:rPr>
-          <w:sz w:val="20"/>
-          <w:szCs w:val="20"/>
-        </w:rPr>
-        <w:t xml:space="preserve">Coordinated logistics for club workshops and department activities.</w:t>
+        <w:t>Coordinate</w:t>
+      </w:r>
+      <w:r>
+        <w:t>d logistics for club workshops and department activities.</w:t>
       </w:r>
     </w:p>
     <w:p>
@@ -429,7 +503,7 @@
         <w:tabs>
           <w:tab w:val="right" w:pos="10080"/>
         </w:tabs>
-        <w:spacing w:after="20" w:before="160"/>
+        <w:spacing w:before="160" w:after="20"/>
       </w:pPr>
       <w:r>
         <w:rPr>
@@ -438,17 +512,16 @@
           <w:sz w:val="21"/>
           <w:szCs w:val="21"/>
         </w:rPr>
-        <w:t xml:space="preserve">Makerspace Ambassador</w:t>
-      </w:r>
-      <w:r>
-        <w:rPr>
-          <w:i/>
-          <w:iCs/>
-          <w:color w:val="333333"/>
-          <w:sz w:val="20"/>
-          <w:szCs w:val="20"/>
-        </w:rPr>
-        <w:t xml:space="preserve">	June 2026 – Present</w:t>
+        <w:t>Makerspace Ambassador</w:t>
+      </w:r>
+      <w:r>
+        <w:rPr>
+          <w:i/>
+          <w:iCs/>
+          <w:color w:val="333333"/>
+        </w:rPr>
+        <w:tab/>
+        <w:t>June 2026 – Present</w:t>
       </w:r>
     </w:p>
     <w:p>
@@ -460,10 +533,8 @@
           <w:i/>
           <w:iCs/>
           <w:color w:val="333333"/>
-          <w:sz w:val="20"/>
-          <w:szCs w:val="20"/>
-        </w:rPr>
-        <w:t xml:space="preserve">KEC Maker’s Space, Kathmandu Engineering College</w:t>
+        </w:rPr>
+        <w:t>KEC Maker’s Space, Kathmandu Engineering College</w:t>
       </w:r>
     </w:p>
     <w:p>
@@ -476,11 +547,15 @@
         <w:spacing w:after="40"/>
       </w:pPr>
       <w:r>
-        <w:rPr>
-          <w:sz w:val="20"/>
-          <w:szCs w:val="20"/>
-        </w:rPr>
-        <w:t xml:space="preserve">Shipped site-wide fixes to the Maker’s Space website — image repair, content consistency, UI cleanup.</w:t>
+        <w:t xml:space="preserve">Shipped site-wide fixes to the Maker’s Space website — image repair, content consistency, UI </w:t>
+      </w:r>
+      <w:proofErr w:type="spellStart"/>
+      <w:r>
+        <w:t>cleanup</w:t>
+      </w:r>
+      <w:proofErr w:type="spellEnd"/>
+      <w:r>
+        <w:t>.</w:t>
       </w:r>
     </w:p>
     <w:p>
@@ -488,7 +563,7 @@
         <w:tabs>
           <w:tab w:val="right" w:pos="10080"/>
         </w:tabs>
-        <w:spacing w:after="20" w:before="160"/>
+        <w:spacing w:before="160" w:after="20"/>
       </w:pPr>
       <w:r>
         <w:rPr>
@@ -497,17 +572,25 @@
           <w:sz w:val="21"/>
           <w:szCs w:val="21"/>
         </w:rPr>
-        <w:t xml:space="preserve">Vice Secretary</w:t>
-      </w:r>
-      <w:r>
-        <w:rPr>
-          <w:i/>
-          <w:iCs/>
-          <w:color w:val="333333"/>
-          <w:sz w:val="20"/>
-          <w:szCs w:val="20"/>
-        </w:rPr>
-        <w:t xml:space="preserve">	2025 – 2026</w:t>
+        <w:t xml:space="preserve">Vice </w:t>
+      </w:r>
+      <w:r>
+        <w:rPr>
+          <w:b/>
+          <w:bCs/>
+          <w:sz w:val="21"/>
+          <w:szCs w:val="21"/>
+        </w:rPr>
+        <w:t>Secretary</w:t>
+      </w:r>
+      <w:r>
+        <w:rPr>
+          <w:i/>
+          <w:iCs/>
+          <w:color w:val="333333"/>
+        </w:rPr>
+        <w:tab/>
+        <w:t>2025 – 2026</w:t>
       </w:r>
     </w:p>
     <w:p>
@@ -519,10 +602,8 @@
           <w:i/>
           <w:iCs/>
           <w:color w:val="333333"/>
-          <w:sz w:val="20"/>
-          <w:szCs w:val="20"/>
-        </w:rPr>
-        <w:t xml:space="preserve">IEEE KEC KTM Student Branch</w:t>
+        </w:rPr>
+        <w:t>IEEE KEC KTM Student Branch</w:t>
       </w:r>
     </w:p>
     <w:p>
@@ -535,11 +616,7 @@
         <w:spacing w:after="40"/>
       </w:pPr>
       <w:r>
-        <w:rPr>
-          <w:sz w:val="20"/>
-          <w:szCs w:val="20"/>
-        </w:rPr>
-        <w:t xml:space="preserve">Streamlined operations and grew program participation by managing documentation and orchestrating workshop logistics.</w:t>
+        <w:t>Streamlined operations and grew program participation by managing documentation and orchestrating workshop logistics.</w:t>
       </w:r>
     </w:p>
     <w:p>
@@ -552,11 +629,7 @@
         <w:spacing w:after="40"/>
       </w:pPr>
       <w:r>
-        <w:rPr>
-          <w:sz w:val="20"/>
-          <w:szCs w:val="20"/>
-        </w:rPr>
-        <w:t xml:space="preserve">Coordinated volunteers alongside the committee for seamless execution.</w:t>
+        <w:t>Coordinated volunteers alongside the committee for seamless execution.</w:t>
       </w:r>
     </w:p>
     <w:p>
@@ -564,7 +637,7 @@
         <w:tabs>
           <w:tab w:val="right" w:pos="10080"/>
         </w:tabs>
-        <w:spacing w:after="20" w:before="160"/>
+        <w:spacing w:before="160" w:after="20"/>
       </w:pPr>
       <w:r>
         <w:rPr>
@@ -573,17 +646,16 @@
           <w:sz w:val="21"/>
           <w:szCs w:val="21"/>
         </w:rPr>
-        <w:t xml:space="preserve">Resource Manager</w:t>
-      </w:r>
-      <w:r>
-        <w:rPr>
-          <w:i/>
-          <w:iCs/>
-          <w:color w:val="333333"/>
-          <w:sz w:val="20"/>
-          <w:szCs w:val="20"/>
-        </w:rPr>
-        <w:t xml:space="preserve">	2024 – 2026</w:t>
+        <w:t>Resource Manager</w:t>
+      </w:r>
+      <w:r>
+        <w:rPr>
+          <w:i/>
+          <w:iCs/>
+          <w:color w:val="333333"/>
+        </w:rPr>
+        <w:tab/>
+        <w:t>2024 – 2026</w:t>
       </w:r>
     </w:p>
     <w:p>
@@ -595,10 +667,8 @@
           <w:i/>
           <w:iCs/>
           <w:color w:val="333333"/>
-          <w:sz w:val="20"/>
-          <w:szCs w:val="20"/>
-        </w:rPr>
-        <w:t xml:space="preserve">Electronics Project Club (EPC), Kathmandu Engineering College</w:t>
+        </w:rPr>
+        <w:t>Electronics Project Club (EPC), Kathmandu Engineering College</w:t>
       </w:r>
     </w:p>
     <w:p>
@@ -611,19 +681,15 @@
         <w:spacing w:after="40"/>
       </w:pPr>
       <w:r>
-        <w:rPr>
-          <w:sz w:val="20"/>
-          <w:szCs w:val="20"/>
-        </w:rPr>
-        <w:t xml:space="preserve">Allocated scheduling and resources for workshops across multiple departments.</w:t>
+        <w:t>Allocated scheduling and resources for workshops across multiple departments.</w:t>
       </w:r>
     </w:p>
     <w:p>
       <w:pPr>
         <w:pBdr>
-          <w:bottom w:val="single" w:color="1F3864" w:sz="6" w:space="2"/>
+          <w:bottom w:val="single" w:sz="6" w:space="2" w:color="1F3864"/>
         </w:pBdr>
-        <w:spacing w:after="100" w:before="260"/>
+        <w:spacing w:before="260" w:after="100"/>
       </w:pPr>
       <w:r>
         <w:rPr>
@@ -634,7 +700,7 @@
           <w:sz w:val="22"/>
           <w:szCs w:val="22"/>
         </w:rPr>
-        <w:t xml:space="preserve">FELLOWSHIPS &amp; RECOGNITIONS</w:t>
+        <w:t>FELLOWSHIPS &amp; RECOGNITIONS</w:t>
       </w:r>
     </w:p>
     <w:p>
@@ -642,7 +708,7 @@
         <w:tabs>
           <w:tab w:val="right" w:pos="10080"/>
         </w:tabs>
-        <w:spacing w:after="20" w:before="160"/>
+        <w:spacing w:before="160" w:after="20"/>
       </w:pPr>
       <w:r>
         <w:rPr>
@@ -651,33 +717,52 @@
           <w:sz w:val="21"/>
           <w:szCs w:val="21"/>
         </w:rPr>
-        <w:t xml:space="preserve">Fuse AI Fellow — Fusemachines AI Fellowship 2026</w:t>
-      </w:r>
-      <w:r>
-        <w:rPr>
-          <w:i/>
-          <w:iCs/>
-          <w:color w:val="333333"/>
-          <w:sz w:val="20"/>
-          <w:szCs w:val="20"/>
-        </w:rPr>
-        <w:t xml:space="preserve">	Active</w:t>
+        <w:t xml:space="preserve">Fuse AI Fellow — </w:t>
+      </w:r>
+      <w:proofErr w:type="spellStart"/>
+      <w:r>
+        <w:rPr>
+          <w:b/>
+          <w:bCs/>
+          <w:sz w:val="21"/>
+          <w:szCs w:val="21"/>
+        </w:rPr>
+        <w:t>Fusemachines</w:t>
+      </w:r>
+      <w:proofErr w:type="spellEnd"/>
+      <w:r>
+        <w:rPr>
+          <w:b/>
+          <w:bCs/>
+          <w:sz w:val="21"/>
+          <w:szCs w:val="21"/>
+        </w:rPr>
+        <w:t xml:space="preserve"> AI Fellowship 2026</w:t>
+      </w:r>
+      <w:r>
+        <w:rPr>
+          <w:i/>
+          <w:iCs/>
+          <w:color w:val="333333"/>
+        </w:rPr>
+        <w:tab/>
+        <w:t>Active</w:t>
       </w:r>
     </w:p>
     <w:p>
       <w:pPr>
         <w:spacing w:after="60"/>
       </w:pPr>
-      <w:r>
-        <w:rPr>
-          <w:i/>
-          <w:iCs/>
-          <w:color w:val="333333"/>
-          <w:sz w:val="20"/>
-          <w:szCs w:val="20"/>
-        </w:rPr>
-        <w:t xml:space="preserve">Fusemachines</w:t>
-      </w:r>
+      <w:proofErr w:type="spellStart"/>
+      <w:r>
+        <w:rPr>
+          <w:i/>
+          <w:iCs/>
+          <w:color w:val="333333"/>
+        </w:rPr>
+        <w:t>Fusemachines</w:t>
+      </w:r>
+      <w:proofErr w:type="spellEnd"/>
     </w:p>
     <w:p>
       <w:pPr>
@@ -689,11 +774,18 @@
         <w:spacing w:after="40"/>
       </w:pPr>
       <w:r>
-        <w:rPr>
-          <w:sz w:val="20"/>
-          <w:szCs w:val="20"/>
-        </w:rPr>
-        <w:t xml:space="preserve">Qualified through the Fusemachines AI Fellowship entrance exam (March 2026): linear algebra, calculus, probability, Python, ML.</w:t>
+        <w:t>Qualifi</w:t>
+      </w:r>
+      <w:r>
+        <w:t xml:space="preserve">ed through the </w:t>
+      </w:r>
+      <w:proofErr w:type="spellStart"/>
+      <w:r>
+        <w:t>Fusemachines</w:t>
+      </w:r>
+      <w:proofErr w:type="spellEnd"/>
+      <w:r>
+        <w:t xml:space="preserve"> AI Fellowship entrance exam (March 2026): linear algebra, calculus, probability, Python, ML.</w:t>
       </w:r>
     </w:p>
     <w:p>
@@ -706,11 +798,7 @@
         <w:spacing w:after="40"/>
       </w:pPr>
       <w:r>
-        <w:rPr>
-          <w:sz w:val="20"/>
-          <w:szCs w:val="20"/>
-        </w:rPr>
-        <w:t xml:space="preserve">Developed a containerized REST API with FastAPI, PostgreSQL, and Docker.</w:t>
+        <w:t>Developed a containerized REST API with FastAPI, PostgreSQL, and Docker.</w:t>
       </w:r>
     </w:p>
     <w:p>
@@ -723,11 +811,10 @@
         <w:spacing w:after="40"/>
       </w:pPr>
       <w:r>
-        <w:rPr>
-          <w:sz w:val="20"/>
-          <w:szCs w:val="20"/>
-        </w:rPr>
-        <w:t xml:space="preserve">Engineered a five-stage agentic Text-to-SQL pipeline (Planner → Generator → Validator → Executor → Summarizer).</w:t>
+        <w:t xml:space="preserve">Engineered a five-stage agentic Text-to-SQL pipeline (Planner </w:t>
+      </w:r>
+      <w:r>
+        <w:t>→ Generator → Validator → Executor → Summarizer).</w:t>
       </w:r>
     </w:p>
     <w:p>
@@ -740,11 +827,7 @@
         <w:spacing w:after="40"/>
       </w:pPr>
       <w:r>
-        <w:rPr>
-          <w:sz w:val="20"/>
-          <w:szCs w:val="20"/>
-        </w:rPr>
-        <w:t xml:space="preserve">Validated the five-stage Text-to-SQL pipeline at 100% execution success and accuracy on a 50-question benchmark.</w:t>
+        <w:t>Validated the five-stage Text-to-SQL pipeline at 100% execution success and accuracy on a 50-question benchmark.</w:t>
       </w:r>
     </w:p>
     <w:p>
@@ -757,11 +840,10 @@
         <w:spacing w:after="40"/>
       </w:pPr>
       <w:r>
-        <w:rPr>
-          <w:sz w:val="20"/>
-          <w:szCs w:val="20"/>
-        </w:rPr>
-        <w:t xml:space="preserve">Created an end-to-end churn and CLV pipeline achieving 5-fold CV ROC-AUC 0.841, threshold-tuned for the top-200 high-risk segment.</w:t>
+        <w:t>Created an end-to-end churn and CLV pipeline achieving 5-fold CV ROC-AUC 0.841, threshold-tun</w:t>
+      </w:r>
+      <w:r>
+        <w:t>ed for the top-200 high-risk segment.</w:t>
       </w:r>
     </w:p>
     <w:p>
@@ -774,11 +856,23 @@
         <w:spacing w:after="40"/>
       </w:pPr>
       <w:r>
-        <w:rPr>
-          <w:sz w:val="20"/>
-          <w:szCs w:val="20"/>
-        </w:rPr>
-        <w:t xml:space="preserve">Trained Random Forest and XGBoost ensembles with SMOTE and SHAP explainability.</w:t>
+        <w:t xml:space="preserve">Trained Random Forest and </w:t>
+      </w:r>
+      <w:proofErr w:type="spellStart"/>
+      <w:r>
+        <w:t>XGBoost</w:t>
+      </w:r>
+      <w:proofErr w:type="spellEnd"/>
+      <w:r>
+        <w:t xml:space="preserve"> ensembles with SMOTE and SHAP </w:t>
+      </w:r>
+      <w:proofErr w:type="spellStart"/>
+      <w:r>
+        <w:t>explainability</w:t>
+      </w:r>
+      <w:proofErr w:type="spellEnd"/>
+      <w:r>
+        <w:t>.</w:t>
       </w:r>
     </w:p>
     <w:p>
@@ -791,11 +885,23 @@
         <w:spacing w:after="40"/>
       </w:pPr>
       <w:r>
-        <w:rPr>
-          <w:sz w:val="20"/>
-          <w:szCs w:val="20"/>
-        </w:rPr>
-        <w:t xml:space="preserve">Implemented probabilistic models spanning Bayesian estimation and Gaussian process regression via PyMC/ArviZ.</w:t>
+        <w:t xml:space="preserve">Implemented probabilistic models spanning Bayesian estimation and Gaussian process regression via </w:t>
+      </w:r>
+      <w:proofErr w:type="spellStart"/>
+      <w:r>
+        <w:t>PyMC</w:t>
+      </w:r>
+      <w:proofErr w:type="spellEnd"/>
+      <w:r>
+        <w:t>/</w:t>
+      </w:r>
+      <w:proofErr w:type="spellStart"/>
+      <w:r>
+        <w:t>ArviZ</w:t>
+      </w:r>
+      <w:proofErr w:type="spellEnd"/>
+      <w:r>
+        <w:t>.</w:t>
       </w:r>
     </w:p>
     <w:p>
@@ -808,11 +914,7 @@
         <w:spacing w:after="40"/>
       </w:pPr>
       <w:r>
-        <w:rPr>
-          <w:sz w:val="20"/>
-          <w:szCs w:val="20"/>
-        </w:rPr>
-        <w:t xml:space="preserve">Segmented customers on UCI Online Retail II (~500K transactions) using K-Means and DBSCAN; delivered an executive narrative.</w:t>
+        <w:t>Segmented customers on UCI Online Retail II (~500K transactions) using K-Means and DBSCAN; delivered an executive narrative.</w:t>
       </w:r>
     </w:p>
     <w:p>
@@ -825,11 +927,7 @@
         <w:spacing w:after="40"/>
       </w:pPr>
       <w:r>
-        <w:rPr>
-          <w:sz w:val="20"/>
-          <w:szCs w:val="20"/>
-        </w:rPr>
-        <w:t xml:space="preserve">Benchmarked nine forecasting models; built a four-model ensemble that achieved MASE 2.44.</w:t>
+        <w:t>Benchmarked nine forecasting models; built a four-model ensemble that achieved MASE 2.44.</w:t>
       </w:r>
     </w:p>
     <w:p>
@@ -837,7 +935,7 @@
         <w:tabs>
           <w:tab w:val="right" w:pos="10080"/>
         </w:tabs>
-        <w:spacing w:after="20" w:before="160"/>
+        <w:spacing w:before="160" w:after="20"/>
       </w:pPr>
       <w:r>
         <w:rPr>
@@ -846,17 +944,44 @@
           <w:sz w:val="21"/>
           <w:szCs w:val="21"/>
         </w:rPr>
-        <w:t xml:space="preserve">NSSR DataCamp Fellow — Cohort 2</w:t>
-      </w:r>
-      <w:r>
-        <w:rPr>
-          <w:i/>
-          <w:iCs/>
-          <w:color w:val="333333"/>
-          <w:sz w:val="20"/>
-          <w:szCs w:val="20"/>
-        </w:rPr>
-        <w:t xml:space="preserve">	2026 – Present</w:t>
+        <w:t xml:space="preserve">NSSR </w:t>
+      </w:r>
+      <w:proofErr w:type="spellStart"/>
+      <w:r>
+        <w:rPr>
+          <w:b/>
+          <w:bCs/>
+          <w:sz w:val="21"/>
+          <w:szCs w:val="21"/>
+        </w:rPr>
+        <w:t>DataCamp</w:t>
+      </w:r>
+      <w:proofErr w:type="spellEnd"/>
+      <w:r>
+        <w:rPr>
+          <w:b/>
+          <w:bCs/>
+          <w:sz w:val="21"/>
+          <w:szCs w:val="21"/>
+        </w:rPr>
+        <w:t xml:space="preserve"> Fellow — Cohort 2</w:t>
+      </w:r>
+      <w:r>
+        <w:rPr>
+          <w:i/>
+          <w:iCs/>
+          <w:color w:val="333333"/>
+        </w:rPr>
+        <w:tab/>
+        <w:t>2026 – Pr</w:t>
+      </w:r>
+      <w:r>
+        <w:rPr>
+          <w:i/>
+          <w:iCs/>
+          <w:color w:val="333333"/>
+        </w:rPr>
+        <w:t>esent</w:t>
       </w:r>
     </w:p>
     <w:p>
@@ -868,10 +993,8 @@
           <w:i/>
           <w:iCs/>
           <w:color w:val="333333"/>
-          <w:sz w:val="20"/>
-          <w:szCs w:val="20"/>
-        </w:rPr>
-        <w:t xml:space="preserve">Nepalese Society of Student Researchers</w:t>
+        </w:rPr>
+        <w:t>Nepalese Society of Student Researchers</w:t>
       </w:r>
     </w:p>
     <w:p>
@@ -884,11 +1007,15 @@
         <w:spacing w:after="40"/>
       </w:pPr>
       <w:r>
-        <w:rPr>
-          <w:sz w:val="20"/>
-          <w:szCs w:val="20"/>
-        </w:rPr>
-        <w:t xml:space="preserve">Secured competitive selection (April 2026) for a sponsored DataCamp Premium license, one of a limited cohort.</w:t>
+        <w:t xml:space="preserve">Secured competitive selection (April 2026) for a sponsored </w:t>
+      </w:r>
+      <w:proofErr w:type="spellStart"/>
+      <w:r>
+        <w:t>DataCamp</w:t>
+      </w:r>
+      <w:proofErr w:type="spellEnd"/>
+      <w:r>
+        <w:t xml:space="preserve"> Premium license, one of a limited cohort.</w:t>
       </w:r>
     </w:p>
     <w:p>
@@ -901,11 +1028,19 @@
         <w:spacing w:after="40"/>
       </w:pPr>
       <w:r>
-        <w:rPr>
-          <w:sz w:val="20"/>
-          <w:szCs w:val="20"/>
-        </w:rPr>
-        <w:t xml:space="preserve">Delivered six applied GenAI solutions, automating null filtering, deduplication, and schema normalization across product and data workflows.</w:t>
+        <w:lastRenderedPageBreak/>
+        <w:t xml:space="preserve">Delivered six applied </w:t>
+      </w:r>
+      <w:proofErr w:type="spellStart"/>
+      <w:r>
+        <w:t>GenAI</w:t>
+      </w:r>
+      <w:proofErr w:type="spellEnd"/>
+      <w:r>
+        <w:t xml:space="preserve"> solutions, automating null filtering, deduplication, and schema normaliz</w:t>
+      </w:r>
+      <w:r>
+        <w:t>ation across product and data workflows.</w:t>
       </w:r>
     </w:p>
     <w:p>
@@ -918,19 +1053,15 @@
         <w:spacing w:after="40"/>
       </w:pPr>
       <w:r>
-        <w:rPr>
-          <w:sz w:val="20"/>
-          <w:szCs w:val="20"/>
-        </w:rPr>
-        <w:t xml:space="preserve">Completed coursework toward SQL Associate and Python Data Associate certifications in PostgreSQL, Pandas, statistics, and scikit-learn.</w:t>
+        <w:t>Completed coursework toward SQL Associate and Python Data Associate certifications in PostgreSQL, Pandas, statistics, and scikit-learn.</w:t>
       </w:r>
     </w:p>
     <w:p>
       <w:pPr>
         <w:pBdr>
-          <w:bottom w:val="single" w:color="1F3864" w:sz="6" w:space="2"/>
+          <w:bottom w:val="single" w:sz="6" w:space="2" w:color="1F3864"/>
         </w:pBdr>
-        <w:spacing w:after="100" w:before="260"/>
+        <w:spacing w:before="260" w:after="100"/>
       </w:pPr>
       <w:r>
         <w:rPr>
@@ -941,12 +1072,12 @@
           <w:sz w:val="22"/>
           <w:szCs w:val="22"/>
         </w:rPr>
-        <w:t xml:space="preserve">PROJECTS</w:t>
-      </w:r>
-    </w:p>
-    <w:p>
-      <w:pPr>
-        <w:spacing w:after="10" w:before="140"/>
+        <w:t>PROJECTS</w:t>
+      </w:r>
+    </w:p>
+    <w:p>
+      <w:pPr>
+        <w:spacing w:before="140" w:after="10"/>
       </w:pPr>
       <w:r>
         <w:rPr>
@@ -955,7 +1086,7 @@
           <w:sz w:val="21"/>
           <w:szCs w:val="21"/>
         </w:rPr>
-        <w:t xml:space="preserve">SPARK — Wearable Fall Detection System (Major Project)</w:t>
+        <w:t>SPARK — Wearable Fall Detection System (Major Project)</w:t>
       </w:r>
     </w:p>
     <w:p>
@@ -970,7 +1101,17 @@
           <w:sz w:val="19"/>
           <w:szCs w:val="19"/>
         </w:rPr>
-        <w:t xml:space="preserve">ESP32-S3 · TensorFlow Lite Micro · SHAP · MQTT · FastAPI · PostgreSQL</w:t>
+        <w:t>ESP32-S3 · Tens</w:t>
+      </w:r>
+      <w:r>
+        <w:rPr>
+          <w:i/>
+          <w:iCs/>
+          <w:color w:val="333333"/>
+          <w:sz w:val="19"/>
+          <w:szCs w:val="19"/>
+        </w:rPr>
+        <w:t>orFlow Lite Micro · SHAP · MQTT · FastAPI · PostgreSQL</w:t>
       </w:r>
     </w:p>
     <w:p>
@@ -983,11 +1124,7 @@
         <w:spacing w:after="40"/>
       </w:pPr>
       <w:r>
-        <w:rPr>
-          <w:sz w:val="20"/>
-          <w:szCs w:val="20"/>
-        </w:rPr>
-        <w:t xml:space="preserve">Designed a two-layer ESP32-S3 fall-detection system combining a &lt;5ms threshold gate with an INT8 1D CNN confirmation layer under 100ms.</w:t>
+        <w:t>Designed a two-layer ESP32-S3 fall-detection system combining a &lt;5ms threshold gate with an INT8 1D CNN confirmation layer under 100ms.</w:t>
       </w:r>
     </w:p>
     <w:p>
@@ -1000,11 +1137,10 @@
         <w:spacing w:after="40"/>
       </w:pPr>
       <w:r>
-        <w:rPr>
-          <w:sz w:val="20"/>
-          <w:szCs w:val="20"/>
-        </w:rPr>
-        <w:t xml:space="preserve">Computed per-event SHAP explanations at a local, non-cloud gateway.</w:t>
+        <w:t>Computed per-event SHAP explanations at a local, non-cloud gatewa</w:t>
+      </w:r>
+      <w:r>
+        <w:t>y.</w:t>
       </w:r>
     </w:p>
     <w:p>
@@ -1017,11 +1153,7 @@
         <w:spacing w:after="40"/>
       </w:pPr>
       <w:r>
-        <w:rPr>
-          <w:sz w:val="20"/>
-          <w:szCs w:val="20"/>
-        </w:rPr>
-        <w:t xml:space="preserve">Presented the SPARK project proposal to the review panel; demo targeted for March 2027.</w:t>
+        <w:t>Presented the SPARK project proposal to the review panel; demo targeted for March 2027.</w:t>
       </w:r>
     </w:p>
     <w:p>
@@ -1034,16 +1166,36 @@
         <w:spacing w:after="40"/>
       </w:pPr>
       <w:r>
-        <w:rPr>
-          <w:sz w:val="20"/>
-          <w:szCs w:val="20"/>
-        </w:rPr>
-        <w:t xml:space="preserve">Led the AI and backend work package (WP 1.0) — CNN training pipeline, FastAPI/PostgreSQL gateway — within a 4-person team supervised by Er. Dipen Manandhar.</w:t>
-      </w:r>
-    </w:p>
-    <w:p>
-      <w:pPr>
-        <w:spacing w:after="10" w:before="140"/>
+        <w:t xml:space="preserve">Led the AI and backend work package (WP 1.0) — CNN training pipeline, FastAPI/PostgreSQL gateway — within a 4-person team supervised by </w:t>
+      </w:r>
+      <w:proofErr w:type="spellStart"/>
+      <w:r>
+        <w:t>Er</w:t>
+      </w:r>
+      <w:proofErr w:type="spellEnd"/>
+      <w:r>
+        <w:t xml:space="preserve">. </w:t>
+      </w:r>
+      <w:proofErr w:type="spellStart"/>
+      <w:r>
+        <w:t>Dipen</w:t>
+      </w:r>
+      <w:proofErr w:type="spellEnd"/>
+      <w:r>
+        <w:t xml:space="preserve"> </w:t>
+      </w:r>
+      <w:proofErr w:type="spellStart"/>
+      <w:r>
+        <w:t>Manandhar</w:t>
+      </w:r>
+      <w:proofErr w:type="spellEnd"/>
+      <w:r>
+        <w:t>.</w:t>
+      </w:r>
+    </w:p>
+    <w:p>
+      <w:pPr>
+        <w:spacing w:before="140" w:after="10"/>
       </w:pPr>
       <w:r>
         <w:rPr>
@@ -1052,7 +1204,16 @@
           <w:sz w:val="21"/>
           <w:szCs w:val="21"/>
         </w:rPr>
-        <w:t xml:space="preserve">Gesture-Controlled Self-Balancing Robot (GCSBR) — Minor Project</w:t>
+        <w:t>Gesture-</w:t>
+      </w:r>
+      <w:r>
+        <w:rPr>
+          <w:b/>
+          <w:bCs/>
+          <w:sz w:val="21"/>
+          <w:szCs w:val="21"/>
+        </w:rPr>
+        <w:t>Controlled Self-Balancing Robot (GCSBR) — Minor Project</w:t>
       </w:r>
     </w:p>
     <w:p>
@@ -1067,7 +1228,7 @@
           <w:sz w:val="19"/>
           <w:szCs w:val="19"/>
         </w:rPr>
-        <w:t xml:space="preserve">Computer Vision · Arduino · MPU6050 · Stepper Motors · Android · MATLAB</w:t>
+        <w:t>Computer Vision · Arduino · MPU6050 · Stepper Motors · Android · MATLAB</w:t>
       </w:r>
     </w:p>
     <w:p>
@@ -1080,11 +1241,7 @@
         <w:spacing w:after="40"/>
       </w:pPr>
       <w:r>
-        <w:rPr>
-          <w:sz w:val="20"/>
-          <w:szCs w:val="20"/>
-        </w:rPr>
-        <w:t xml:space="preserve">Earned a 'major project level' rating from the examiner.</w:t>
+        <w:t>Earned a 'major project level' rating from the examiner.</w:t>
       </w:r>
     </w:p>
     <w:p>
@@ -1097,11 +1254,10 @@
         <w:spacing w:after="40"/>
       </w:pPr>
       <w:r>
-        <w:rPr>
-          <w:sz w:val="20"/>
-          <w:szCs w:val="20"/>
-        </w:rPr>
-        <w:t xml:space="preserve">Implemented PID stabilization firmware, validated via a MATLAB-simulation-to-hardware pipeline.</w:t>
+        <w:t>Implemented PID stabilization firmware, validated via a MATLAB-simulati</w:t>
+      </w:r>
+      <w:r>
+        <w:t>on-to-hardware pipeline.</w:t>
       </w:r>
     </w:p>
     <w:p>
@@ -1114,16 +1270,20 @@
         <w:spacing w:after="40"/>
       </w:pPr>
       <w:r>
-        <w:rPr>
-          <w:sz w:val="20"/>
-          <w:szCs w:val="20"/>
-        </w:rPr>
-        <w:t xml:space="preserve">Developed an Android gesture-control app (MediaPipe, CameraX, HC-05 BT) driving motors for real-time actuation.</w:t>
-      </w:r>
-    </w:p>
-    <w:p>
-      <w:pPr>
-        <w:spacing w:after="10" w:before="140"/>
+        <w:t xml:space="preserve">Developed an Android gesture-control app (MediaPipe, </w:t>
+      </w:r>
+      <w:proofErr w:type="spellStart"/>
+      <w:r>
+        <w:t>CameraX</w:t>
+      </w:r>
+      <w:proofErr w:type="spellEnd"/>
+      <w:r>
+        <w:t>, HC-05 BT) driving motors for real-time actuation.</w:t>
+      </w:r>
+    </w:p>
+    <w:p>
+      <w:pPr>
+        <w:spacing w:before="140" w:after="10"/>
       </w:pPr>
       <w:r>
         <w:rPr>
@@ -1132,7 +1292,7 @@
           <w:sz w:val="21"/>
           <w:szCs w:val="21"/>
         </w:rPr>
-        <w:t xml:space="preserve">Edge AI Stability Detection System</w:t>
+        <w:t>Edge AI Stability Detection System</w:t>
       </w:r>
     </w:p>
     <w:p>
@@ -1147,7 +1307,7 @@
           <w:sz w:val="19"/>
           <w:szCs w:val="19"/>
         </w:rPr>
-        <w:t xml:space="preserve">Python · Scikit-learn · FastAPI · Joblib</w:t>
+        <w:t>Python · Scikit-learn · FastAPI · Joblib</w:t>
       </w:r>
     </w:p>
     <w:p>
@@ -1160,16 +1320,15 @@
         <w:spacing w:after="40"/>
       </w:pPr>
       <w:r>
-        <w:rPr>
-          <w:sz w:val="20"/>
-          <w:szCs w:val="20"/>
-        </w:rPr>
-        <w:t xml:space="preserve">Predicted platform stability from simulated IMU data using a Random Forest model, reaching 99.8% test accuracy; served via FastAPI.</w:t>
-      </w:r>
-    </w:p>
-    <w:p>
-      <w:pPr>
-        <w:spacing w:after="10" w:before="140"/>
+        <w:t>Predicted platform stability from simulated</w:t>
+      </w:r>
+      <w:r>
+        <w:t xml:space="preserve"> IMU data using a Random Forest model, reaching 99.8% test accuracy; served via FastAPI.</w:t>
+      </w:r>
+    </w:p>
+    <w:p>
+      <w:pPr>
+        <w:spacing w:before="140" w:after="10"/>
       </w:pPr>
       <w:r>
         <w:rPr>
@@ -1178,7 +1337,7 @@
           <w:sz w:val="21"/>
           <w:szCs w:val="21"/>
         </w:rPr>
-        <w:t xml:space="preserve">Alpha Android Super-App</w:t>
+        <w:t>Alpha Android Super-App</w:t>
       </w:r>
     </w:p>
     <w:p>
@@ -1193,7 +1352,29 @@
           <w:sz w:val="19"/>
           <w:szCs w:val="19"/>
         </w:rPr>
-        <w:t xml:space="preserve">Kotlin · Jetpack Compose · Material3 · DataStore · Apache POI</w:t>
+        <w:t xml:space="preserve">Kotlin · Jetpack Compose · Material3 · </w:t>
+      </w:r>
+      <w:proofErr w:type="spellStart"/>
+      <w:r>
+        <w:rPr>
+          <w:i/>
+          <w:iCs/>
+          <w:color w:val="333333"/>
+          <w:sz w:val="19"/>
+          <w:szCs w:val="19"/>
+        </w:rPr>
+        <w:t>DataStore</w:t>
+      </w:r>
+      <w:proofErr w:type="spellEnd"/>
+      <w:r>
+        <w:rPr>
+          <w:i/>
+          <w:iCs/>
+          <w:color w:val="333333"/>
+          <w:sz w:val="19"/>
+          <w:szCs w:val="19"/>
+        </w:rPr>
+        <w:t xml:space="preserve"> · Apache POI</w:t>
       </w:r>
     </w:p>
     <w:p>
@@ -1206,16 +1387,20 @@
         <w:spacing w:after="40"/>
       </w:pPr>
       <w:r>
-        <w:rPr>
-          <w:sz w:val="20"/>
-          <w:szCs w:val="20"/>
-        </w:rPr>
-        <w:t xml:space="preserve">Assembled a modular Android super-app (SDK 36) with gesture control, an eSewa Gmail budget tracker, and a Material3 design system.</w:t>
-      </w:r>
-    </w:p>
-    <w:p>
-      <w:pPr>
-        <w:spacing w:after="10" w:before="140"/>
+        <w:t xml:space="preserve">Assembled a modular Android super-app (SDK 36) with gesture control, an </w:t>
+      </w:r>
+      <w:proofErr w:type="spellStart"/>
+      <w:r>
+        <w:t>eSewa</w:t>
+      </w:r>
+      <w:proofErr w:type="spellEnd"/>
+      <w:r>
+        <w:t xml:space="preserve"> Gmail budget tracker, and a Material3 design system.</w:t>
+      </w:r>
+    </w:p>
+    <w:p>
+      <w:pPr>
+        <w:spacing w:before="140" w:after="10"/>
       </w:pPr>
       <w:r>
         <w:rPr>
@@ -1224,7 +1409,7 @@
           <w:sz w:val="21"/>
           <w:szCs w:val="21"/>
         </w:rPr>
-        <w:t xml:space="preserve">Nexus — Personal AI Operating System</w:t>
+        <w:t>Nexus — Personal AI Operating System</w:t>
       </w:r>
     </w:p>
     <w:p>
@@ -1239,8 +1424,64 @@
           <w:sz w:val="19"/>
           <w:szCs w:val="19"/>
         </w:rPr>
-        <w:t xml:space="preserve">React (Vite) · FastAPI · SQLite + FTS5 · httpx · asyncio</w:t>
-      </w:r>
+        <w:t>React (</w:t>
+      </w:r>
+      <w:proofErr w:type="spellStart"/>
+      <w:r>
+        <w:rPr>
+          <w:i/>
+          <w:iCs/>
+          <w:color w:val="333333"/>
+          <w:sz w:val="19"/>
+          <w:szCs w:val="19"/>
+        </w:rPr>
+        <w:t>Vite</w:t>
+      </w:r>
+      <w:proofErr w:type="spellEnd"/>
+      <w:r>
+        <w:rPr>
+          <w:i/>
+          <w:iCs/>
+          <w:color w:val="333333"/>
+          <w:sz w:val="19"/>
+          <w:szCs w:val="19"/>
+        </w:rPr>
+        <w:t xml:space="preserve">) · FastAPI · SQLite + FTS5 · </w:t>
+      </w:r>
+      <w:proofErr w:type="spellStart"/>
+      <w:r>
+        <w:rPr>
+          <w:i/>
+          <w:iCs/>
+          <w:color w:val="333333"/>
+          <w:sz w:val="19"/>
+          <w:szCs w:val="19"/>
+        </w:rPr>
+        <w:t>httpx</w:t>
+      </w:r>
+      <w:proofErr w:type="spellEnd"/>
+      <w:r>
+        <w:rPr>
+          <w:i/>
+          <w:iCs/>
+          <w:color w:val="333333"/>
+          <w:sz w:val="19"/>
+          <w:szCs w:val="19"/>
+        </w:rPr>
+        <w:t xml:space="preserve"> · </w:t>
+      </w:r>
+      <w:proofErr w:type="spellStart"/>
+      <w:r>
+        <w:rPr>
+          <w:i/>
+          <w:iCs/>
+          <w:color w:val="333333"/>
+          <w:sz w:val="19"/>
+          <w:szCs w:val="19"/>
+        </w:rPr>
+        <w:t>asyncio</w:t>
+      </w:r>
+      <w:proofErr w:type="spellEnd"/>
     </w:p>
     <w:p>
       <w:pPr>
@@ -1252,19 +1493,26 @@
         <w:spacing w:after="40"/>
       </w:pPr>
       <w:r>
-        <w:rPr>
-          <w:sz w:val="20"/>
-          <w:szCs w:val="20"/>
-        </w:rPr>
-        <w:t xml:space="preserve">Unified Groq (Llama 3.3 70B) and Gemini into an AI workspace via parallel fan-out routing, with SQLite + FTS5 context injection.</w:t>
+        <w:t xml:space="preserve">Unified </w:t>
+      </w:r>
+      <w:proofErr w:type="spellStart"/>
+      <w:r>
+        <w:t>Groq</w:t>
+      </w:r>
+      <w:proofErr w:type="spellEnd"/>
+      <w:r>
+        <w:t xml:space="preserve"> (Llama 3.3 70B) an</w:t>
+      </w:r>
+      <w:r>
+        <w:t>d Gemini into an AI workspace via parallel fan-out routing, with SQLite + FTS5 context injection.</w:t>
       </w:r>
     </w:p>
     <w:p>
       <w:pPr>
         <w:pBdr>
-          <w:bottom w:val="single" w:color="1F3864" w:sz="6" w:space="2"/>
+          <w:bottom w:val="single" w:sz="6" w:space="2" w:color="1F3864"/>
         </w:pBdr>
-        <w:spacing w:after="100" w:before="260"/>
+        <w:spacing w:before="260" w:after="100"/>
       </w:pPr>
       <w:r>
         <w:rPr>
@@ -1275,7 +1523,7 @@
           <w:sz w:val="22"/>
           <w:szCs w:val="22"/>
         </w:rPr>
-        <w:t xml:space="preserve">SKILLS</w:t>
+        <w:t>SKILLS</w:t>
       </w:r>
     </w:p>
     <w:p>
@@ -1286,17 +1534,11 @@
         <w:rPr>
           <w:b/>
           <w:bCs/>
-          <w:sz w:val="20"/>
-          <w:szCs w:val="20"/>
         </w:rPr>
         <w:t xml:space="preserve">Programming: </w:t>
       </w:r>
       <w:r>
-        <w:rPr>
-          <w:sz w:val="20"/>
-          <w:szCs w:val="20"/>
-        </w:rPr>
-        <w:t xml:space="preserve">Python, C, C++, Kotlin, SQL (PostgreSQL / SQLite), VHDL</w:t>
+        <w:t>Python, C, C++, Kotlin, SQL (PostgreSQL / SQLite), VHDL</w:t>
       </w:r>
     </w:p>
     <w:p>
@@ -1307,17 +1549,81 @@
         <w:rPr>
           <w:b/>
           <w:bCs/>
-          <w:sz w:val="20"/>
-          <w:szCs w:val="20"/>
         </w:rPr>
         <w:t xml:space="preserve">Machine Learning: </w:t>
       </w:r>
       <w:r>
-        <w:rPr>
-          <w:sz w:val="20"/>
-          <w:szCs w:val="20"/>
-        </w:rPr>
-        <w:t xml:space="preserve">scikit-learn, NumPy, Pandas, XGBoost, Random Forest, Logistic/Ridge/SGD Classifiers, Lasso, ElasticNet, SMOTE (ImbPipeline), SHAP, GridSearchCV, Stratified K-Fold CV, Joblib, PyMC, ArviZ, pgmpy, Bayesian Inference, Gaussian Process Regression, K-Means, Hierarchical Clustering, DBSCAN, Time Series Forecasting (SARIMA, Holt-Winters, Prophet, LightGBM, LSTM)</w:t>
+        <w:t xml:space="preserve">scikit-learn, NumPy, Pandas, </w:t>
+      </w:r>
+      <w:proofErr w:type="spellStart"/>
+      <w:r>
+        <w:t>XGBoost</w:t>
+      </w:r>
+      <w:proofErr w:type="spellEnd"/>
+      <w:r>
+        <w:t>, Random Forest, Logistic/Ri</w:t>
+      </w:r>
+      <w:r>
+        <w:t xml:space="preserve">dge/SGD Classifiers, Lasso, </w:t>
+      </w:r>
+      <w:proofErr w:type="spellStart"/>
+      <w:r>
+        <w:t>ElasticNet</w:t>
+      </w:r>
+      <w:proofErr w:type="spellEnd"/>
+      <w:r>
+        <w:t>, SMOTE (</w:t>
+      </w:r>
+      <w:proofErr w:type="spellStart"/>
+      <w:r>
+        <w:t>ImbPipeline</w:t>
+      </w:r>
+      <w:proofErr w:type="spellEnd"/>
+      <w:r>
+        <w:t xml:space="preserve">), SHAP, </w:t>
+      </w:r>
+      <w:proofErr w:type="spellStart"/>
+      <w:r>
+        <w:t>GridSearchCV</w:t>
+      </w:r>
+      <w:proofErr w:type="spellEnd"/>
+      <w:r>
+        <w:t xml:space="preserve">, Stratified K-Fold CV, Joblib, </w:t>
+      </w:r>
+      <w:proofErr w:type="spellStart"/>
+      <w:r>
+        <w:t>PyMC</w:t>
+      </w:r>
+      <w:proofErr w:type="spellEnd"/>
+      <w:r>
+        <w:t xml:space="preserve">, </w:t>
+      </w:r>
+      <w:proofErr w:type="spellStart"/>
+      <w:r>
+        <w:t>ArviZ</w:t>
+      </w:r>
+      <w:proofErr w:type="spellEnd"/>
+      <w:r>
+        <w:t xml:space="preserve">, </w:t>
+      </w:r>
+      <w:proofErr w:type="spellStart"/>
+      <w:r>
+        <w:t>pgmpy</w:t>
+      </w:r>
+      <w:proofErr w:type="spellEnd"/>
+      <w:r>
+        <w:t>, Bayesian Inference, Gaussian Process Regression, K-Means, Hierarchical Clustering, DBSCAN, Time Series Forecasting (SARIMA, H</w:t>
+      </w:r>
+      <w:r>
+        <w:t xml:space="preserve">olt-Winters, Prophet, </w:t>
+      </w:r>
+      <w:proofErr w:type="spellStart"/>
+      <w:r>
+        <w:t>LightGBM</w:t>
+      </w:r>
+      <w:proofErr w:type="spellEnd"/>
+      <w:r>
+        <w:t>, LSTM)</w:t>
       </w:r>
     </w:p>
     <w:p>
@@ -1328,17 +1634,27 @@
         <w:rPr>
           <w:b/>
           <w:bCs/>
-          <w:sz w:val="20"/>
-          <w:szCs w:val="20"/>
         </w:rPr>
         <w:t xml:space="preserve">Android Development: </w:t>
       </w:r>
       <w:r>
-        <w:rPr>
-          <w:sz w:val="20"/>
-          <w:szCs w:val="20"/>
-        </w:rPr>
-        <w:t xml:space="preserve">Kotlin, Jetpack Compose, Material3, DataStore, CameraX, MediaPipe, Apache POI</w:t>
+        <w:t xml:space="preserve">Kotlin, Jetpack Compose, Material3, </w:t>
+      </w:r>
+      <w:proofErr w:type="spellStart"/>
+      <w:r>
+        <w:t>DataStore</w:t>
+      </w:r>
+      <w:proofErr w:type="spellEnd"/>
+      <w:r>
+        <w:t xml:space="preserve">, </w:t>
+      </w:r>
+      <w:proofErr w:type="spellStart"/>
+      <w:r>
+        <w:t>CameraX</w:t>
+      </w:r>
+      <w:proofErr w:type="spellEnd"/>
+      <w:r>
+        <w:t>, MediaPipe, Apache POI</w:t>
       </w:r>
     </w:p>
     <w:p>
@@ -1349,17 +1665,27 @@
         <w:rPr>
           <w:b/>
           <w:bCs/>
-          <w:sz w:val="20"/>
-          <w:szCs w:val="20"/>
         </w:rPr>
         <w:t xml:space="preserve">Deployment: </w:t>
       </w:r>
       <w:r>
-        <w:rPr>
-          <w:sz w:val="20"/>
-          <w:szCs w:val="20"/>
-        </w:rPr>
-        <w:t xml:space="preserve">FastAPI, REST APIs, Docker, PostgreSQL, Streamlit, asyncio, Joblib</w:t>
+        <w:t xml:space="preserve">FastAPI, REST APIs, Docker, PostgreSQL, </w:t>
+      </w:r>
+      <w:proofErr w:type="spellStart"/>
+      <w:r>
+        <w:t>Streamlit</w:t>
+      </w:r>
+      <w:proofErr w:type="spellEnd"/>
+      <w:r>
+        <w:t xml:space="preserve">, </w:t>
+      </w:r>
+      <w:proofErr w:type="spellStart"/>
+      <w:r>
+        <w:t>asyncio</w:t>
+      </w:r>
+      <w:proofErr w:type="spellEnd"/>
+      <w:r>
+        <w:t>, Joblib</w:t>
       </w:r>
     </w:p>
     <w:p>
@@ -1370,18 +1696,20 @@
         <w:rPr>
           <w:b/>
           <w:bCs/>
-          <w:sz w:val="20"/>
-          <w:szCs w:val="20"/>
         </w:rPr>
         <w:t xml:space="preserve">Embedded Systems: </w:t>
       </w:r>
       <w:r>
-        <w:rPr>
-          <w:sz w:val="20"/>
-          <w:szCs w:val="20"/>
-        </w:rPr>
-        <w:t xml:space="preserve">Arduino, ESP32-S3, MPU6050, Stepper Motors, HC-05 BT, UART, MQTT, FPGA, Vivado</w:t>
-      </w:r>
+        <w:t>Arduino, ESP32-S3, MPU</w:t>
+      </w:r>
+      <w:r>
+        <w:t xml:space="preserve">6050, Stepper Motors, HC-05 BT, UART, MQTT, FPGA, </w:t>
+      </w:r>
+      <w:proofErr w:type="spellStart"/>
+      <w:r>
+        <w:t>Vivado</w:t>
+      </w:r>
+      <w:proofErr w:type="spellEnd"/>
     </w:p>
     <w:p>
       <w:pPr>
@@ -1391,17 +1719,24 @@
         <w:rPr>
           <w:b/>
           <w:bCs/>
-          <w:sz w:val="20"/>
-          <w:szCs w:val="20"/>
         </w:rPr>
         <w:t xml:space="preserve">AI / Local LLM: </w:t>
       </w:r>
-      <w:r>
-        <w:rPr>
-          <w:sz w:val="20"/>
-          <w:szCs w:val="20"/>
-        </w:rPr>
-        <w:t xml:space="preserve">Ollama, AnythingLLM, Prompt Chaining, Agentic Query Systems</w:t>
+      <w:proofErr w:type="spellStart"/>
+      <w:r>
+        <w:t>Ollama</w:t>
+      </w:r>
+      <w:proofErr w:type="spellEnd"/>
+      <w:r>
+        <w:t xml:space="preserve">, </w:t>
+      </w:r>
+      <w:proofErr w:type="spellStart"/>
+      <w:r>
+        <w:t>AnythingLLM</w:t>
+      </w:r>
+      <w:proofErr w:type="spellEnd"/>
+      <w:r>
+        <w:t>, Prompt Chaining, Agentic Query Systems</w:t>
       </w:r>
     </w:p>
     <w:p>
@@ -1412,17 +1747,19 @@
         <w:rPr>
           <w:b/>
           <w:bCs/>
-          <w:sz w:val="20"/>
-          <w:szCs w:val="20"/>
         </w:rPr>
         <w:t xml:space="preserve">Tools: </w:t>
       </w:r>
       <w:r>
-        <w:rPr>
-          <w:sz w:val="20"/>
-          <w:szCs w:val="20"/>
-        </w:rPr>
-        <w:t xml:space="preserve">Git, GitHub, VS Code, Jupyter Notebook, Google Colab, MATLAB, LaTeX / Overleaf, SSMS</w:t>
+        <w:t xml:space="preserve">Git, GitHub, VS Code, Jupyter Notebook, Google </w:t>
+      </w:r>
+      <w:proofErr w:type="spellStart"/>
+      <w:r>
+        <w:t>Colab</w:t>
+      </w:r>
+      <w:proofErr w:type="spellEnd"/>
+      <w:r>
+        <w:t>, MATLAB, LaTeX / Overleaf, SSMS</w:t>
       </w:r>
     </w:p>
     <w:p>
@@ -1433,25 +1770,22 @@
         <w:rPr>
           <w:b/>
           <w:bCs/>
-          <w:sz w:val="20"/>
-          <w:szCs w:val="20"/>
         </w:rPr>
         <w:t xml:space="preserve">Other: </w:t>
       </w:r>
       <w:r>
-        <w:rPr>
-          <w:sz w:val="20"/>
-          <w:szCs w:val="20"/>
-        </w:rPr>
-        <w:t xml:space="preserve">Project Coordination, Public Relations, Microsoft Office, Canva</w:t>
+        <w:t>Project Coordination, Pu</w:t>
+      </w:r>
+      <w:r>
+        <w:t>blic Relations, Microsoft Office, Canva</w:t>
       </w:r>
     </w:p>
     <w:p>
       <w:pPr>
         <w:pBdr>
-          <w:bottom w:val="single" w:color="1F3864" w:sz="6" w:space="2"/>
+          <w:bottom w:val="single" w:sz="6" w:space="2" w:color="1F3864"/>
         </w:pBdr>
-        <w:spacing w:after="100" w:before="260"/>
+        <w:spacing w:before="260" w:after="100"/>
       </w:pPr>
       <w:r>
         <w:rPr>
@@ -1462,7 +1796,7 @@
           <w:sz w:val="22"/>
           <w:szCs w:val="22"/>
         </w:rPr>
-        <w:t xml:space="preserve">CERTIFICATIONS &amp; ACTIVITIES</w:t>
+        <w:t>CERTIFICATIONS &amp; ACTIVITIES</w:t>
       </w:r>
     </w:p>
     <w:p>
@@ -1474,7 +1808,78 @@
           <w:sz w:val="19"/>
           <w:szCs w:val="19"/>
         </w:rPr>
-        <w:t xml:space="preserve">IEEE WIE Nepal LaTeX Workshop (May 2026) · IEEE SPAx organizing team · Prompt Engineering Fundamentals, TechAxis · IEEEXtreme 19.0 (Team ShadowXTREME) · PCB Design &amp; Fabrication Workshop, KEC Robotics Club · AWS Cloud Computing Workshop · Microsoft Learn Student Ambassador</w:t>
+        <w:t xml:space="preserve">IEEE WIE Nepal LaTeX Workshop (May 2026) · IEEE </w:t>
+      </w:r>
+      <w:proofErr w:type="spellStart"/>
+      <w:r>
+        <w:rPr>
+          <w:sz w:val="19"/>
+          <w:szCs w:val="19"/>
+        </w:rPr>
+        <w:t>SPAx</w:t>
+      </w:r>
+      <w:proofErr w:type="spellEnd"/>
+      <w:r>
+        <w:rPr>
+          <w:sz w:val="19"/>
+          <w:szCs w:val="19"/>
+        </w:rPr>
+        <w:t xml:space="preserve"> organizing team · Prompt Engineering Fundamentals, </w:t>
+      </w:r>
+      <w:proofErr w:type="spellStart"/>
+      <w:r>
+        <w:rPr>
+          <w:sz w:val="19"/>
+          <w:szCs w:val="19"/>
+        </w:rPr>
+        <w:t>TechAxis</w:t>
+      </w:r>
+      <w:proofErr w:type="spellEnd"/>
+      <w:r>
+        <w:rPr>
+          <w:sz w:val="19"/>
+          <w:szCs w:val="19"/>
+        </w:rPr>
+        <w:t xml:space="preserve"> · </w:t>
+      </w:r>
+      <w:proofErr w:type="spellStart"/>
+      <w:r>
+        <w:rPr>
+          <w:sz w:val="19"/>
+          <w:szCs w:val="19"/>
+        </w:rPr>
+        <w:t>IEEEXtreme</w:t>
+      </w:r>
+      <w:proofErr w:type="spellEnd"/>
+      <w:r>
+        <w:rPr>
+          <w:sz w:val="19"/>
+          <w:szCs w:val="19"/>
+        </w:rPr>
+        <w:t xml:space="preserve"> 19.0 (Team </w:t>
+      </w:r>
+      <w:proofErr w:type="spellStart"/>
+      <w:r>
+        <w:rPr>
+          <w:sz w:val="19"/>
+          <w:szCs w:val="19"/>
+        </w:rPr>
+        <w:t>ShadowXTREME</w:t>
+      </w:r>
+      <w:proofErr w:type="spellEnd"/>
+      <w:r>
+        <w:rPr>
+          <w:sz w:val="19"/>
+          <w:szCs w:val="19"/>
+        </w:rPr>
+        <w:t xml:space="preserve">) · PCB Design &amp; Fabrication Workshop, </w:t>
+      </w:r>
+      <w:r>
+        <w:rPr>
+          <w:sz w:val="19"/>
+          <w:szCs w:val="19"/>
+        </w:rPr>
+        <w:t>KEC Robotics Club · AWS Cloud Computing Workshop · Microsoft Learn Student Ambassador</w:t>
       </w:r>
     </w:p>
     <w:p>
@@ -1489,7 +1894,7 @@
           <w:sz w:val="18"/>
           <w:szCs w:val="18"/>
         </w:rPr>
-        <w:t xml:space="preserve">Participate in IEEE KEC KTM Student Branch, Electronics Project Club, KEC Maker’s Space, and KEC Music Club.</w:t>
+        <w:t>Participate in IEEE KEC KTM Student Branch, Electronics Project Club, KEC Maker’s Space, and KEC Music Club.</w:t>
       </w:r>
     </w:p>
     <w:p>
@@ -1504,102 +1909,26 @@
           <w:sz w:val="16"/>
           <w:szCs w:val="16"/>
         </w:rPr>
-        <w:t xml:space="preserve">Last Updated: August 24, 2026</w:t>
+        <w:t>Last Updated: August 24, 2026</w:t>
       </w:r>
     </w:p>
     <w:sectPr>
-      <w:pgSz w:w="11906" w:h="16838" w:orient="portrait"/>
+      <w:pgSz w:w="11906" w:h="16838"/>
       <w:pgMar w:top="620" w:right="620" w:bottom="620" w:left="620" w:header="708" w:footer="708" w:gutter="0"/>
-      <w:pgNumType/>
+      <w:cols w:space="720"/>
       <w:docGrid w:linePitch="360"/>
     </w:sectPr>
   </w:body>
 </w:document>
 </file>
 
-<file path=word/comments.xml><?xml version="1.0" encoding="utf-8"?>
-<w:comments xmlns:cx="http://schemas.microsoft.com/office/drawing/2014/chartex" xmlns:cx1="http://schemas.microsoft.com/office/drawing/2015/9/8/chartex" xmlns:cx2="http://schemas.microsoft.com/office/drawing/2015/10/21/chartex" xmlns:cx3="http://schemas.microsoft.com/office/drawing/2016/5/9/chartex" xmlns:cx4="http://schemas.microsoft.com/office/drawing/2016/5/10/chartex" xmlns:cx5="http://schemas.microsoft.com/office/drawing/2016/5/11/chartex" xmlns:cx6="http://schemas.microsoft.com/office/drawing/2016/5/12/chartex" xmlns:cx7="http://schemas.microsoft.com/office/drawing/2016/5/13/chartex" xmlns:cx8="http://schemas.microsoft.com/office/drawing/2016/5/14/chartex" xmlns:mc="http://schemas.openxmlformats.org/markup-compatibility/2006" xmlns:aink="http://schemas.microsoft.com/office/drawing/2016/ink" xmlns:am3d="http://schemas.microsoft.com/office/drawing/2017/model3d" xmlns:o="urn:schemas-microsoft-com:office:office" xmlns:r="http://schemas.openxmlformats.org/officeDocument/2006/relationships" xmlns:m="http://schemas.openxmlformats.org/officeDocument/2006/math" xmlns:v="urn:schemas-microsoft-com:vml" xmlns:wp14="http://schemas.microsoft.com/office/word/2010/wordprocessingDrawing" xmlns:wp="http://schemas.openxmlformats.org/drawingml/2006/wordprocessingDrawing" xmlns:w10="urn:schemas-microsoft-com:office:word" xmlns:w="http://schemas.openxmlformats.org/wordprocessingml/2006/main" xmlns:w14="http://schemas.microsoft.com/office/word/2010/wordml" xmlns:w15="http://schemas.microsoft.com/office/word/2012/wordml" xmlns:w16cex="http://schemas.microsoft.com/office/word/2018/wordml/cex" xmlns:w16cid="http://schemas.microsoft.com/office/word/2016/wordml/cid" xmlns:w16="http://schemas.microsoft.com/office/word/2018/wordml" xmlns:w16sdtdh="http://schemas.microsoft.com/office/word/2020/wordml/sdtdatahash" xmlns:w16se="http://schemas.microsoft.com/office/word/2015/wordml/symex" xmlns:wpg="http://schemas.microsoft.com/office/word/2010/wordprocessingGroup" xmlns:wpi="http://schemas.microsoft.com/office/word/2010/wordprocessingInk" xmlns:wne="http://schemas.microsoft.com/office/word/2006/wordml" xmlns:wps="http://schemas.microsoft.com/office/word/2010/wordprocessingShape"/>
-</file>
-
-<file path=word/endnotes.xml><?xml version="1.0" encoding="utf-8"?>
-<w:endnotes xmlns:wpc="http://schemas.microsoft.com/office/word/2010/wordprocessingCanvas" xmlns:mc="http://schemas.openxmlformats.org/markup-compatibility/2006" xmlns:o="urn:schemas-microsoft-com:office:office" xmlns:r="http://schemas.openxmlformats.org/officeDocument/2006/relationships" xmlns:m="http://schemas.openxmlformats.org/officeDocument/2006/math" xmlns:v="urn:schemas-microsoft-com:vml" xmlns:wp14="http://schemas.microsoft.com/office/word/2010/wordprocessingDrawing" xmlns:wp="http://schemas.openxmlformats.org/drawingml/2006/wordprocessingDrawing" xmlns:w10="urn:schemas-microsoft-com:office:word" xmlns:w="http://schemas.openxmlformats.org/wordprocessingml/2006/main" xmlns:w14="http://schemas.microsoft.com/office/word/2010/wordml" xmlns:w15="http://schemas.microsoft.com/office/word/2012/wordml" xmlns:wpg="http://schemas.microsoft.com/office/word/2010/wordprocessingGroup" xmlns:wpi="http://schemas.microsoft.com/office/word/2010/wordprocessingInk" xmlns:wne="http://schemas.microsoft.com/office/word/2006/wordml" xmlns:wps="http://schemas.microsoft.com/office/word/2010/wordprocessingShape" mc:Ignorable="w14 w15 wp14">
-  <w:endnote w:type="separator" w:id="-1">
-    <w:p>
-      <w:pPr>
-        <w:spacing w:after="0" w:line="240" w:lineRule="auto"/>
-      </w:pPr>
-      <w:r>
-        <w:rPr>
-          <w:rStyle w:val="EndnoteReference"/>
-        </w:rPr>
-        <w:endnoteRef/>
-      </w:r>
-      <w:r>
-        <w:separator/>
-      </w:r>
-    </w:p>
-  </w:endnote>
-  <w:endnote w:type="continuationSeparator" w:id="0">
-    <w:p>
-      <w:pPr>
-        <w:spacing w:after="0" w:line="240" w:lineRule="auto"/>
-      </w:pPr>
-      <w:r>
-        <w:rPr>
-          <w:rStyle w:val="EndnoteReference"/>
-        </w:rPr>
-        <w:endnoteRef/>
-      </w:r>
-      <w:r>
-        <w:continuationSeparator/>
-      </w:r>
-    </w:p>
-  </w:endnote>
-</w:endnotes>
-</file>
-
-<file path=word/footnotes.xml><?xml version="1.0" encoding="utf-8"?>
-<w:footnotes xmlns:wpc="http://schemas.microsoft.com/office/word/2010/wordprocessingCanvas" xmlns:mc="http://schemas.openxmlformats.org/markup-compatibility/2006" xmlns:o="urn:schemas-microsoft-com:office:office" xmlns:r="http://schemas.openxmlformats.org/officeDocument/2006/relationships" xmlns:m="http://schemas.openxmlformats.org/officeDocument/2006/math" xmlns:v="urn:schemas-microsoft-com:vml" xmlns:wp14="http://schemas.microsoft.com/office/word/2010/wordprocessingDrawing" xmlns:wp="http://schemas.openxmlformats.org/drawingml/2006/wordprocessingDrawing" xmlns:w10="urn:schemas-microsoft-com:office:word" xmlns:w="http://schemas.openxmlformats.org/wordprocessingml/2006/main" xmlns:w14="http://schemas.microsoft.com/office/word/2010/wordml" xmlns:w15="http://schemas.microsoft.com/office/word/2012/wordml" xmlns:wpg="http://schemas.microsoft.com/office/word/2010/wordprocessingGroup" xmlns:wpi="http://schemas.microsoft.com/office/word/2010/wordprocessingInk" xmlns:wne="http://schemas.microsoft.com/office/word/2006/wordml" xmlns:wps="http://schemas.microsoft.com/office/word/2010/wordprocessingShape" mc:Ignorable="w14 w15 wp14">
-  <w:footnote w:type="separator" w:id="-1">
-    <w:p>
-      <w:pPr>
-        <w:spacing w:after="0" w:line="240" w:lineRule="auto"/>
-      </w:pPr>
-      <w:r>
-        <w:rPr>
-          <w:rStyle w:val="FootnoteReference"/>
-        </w:rPr>
-        <w:footnoteRef/>
-      </w:r>
-      <w:r>
-        <w:separator/>
-      </w:r>
-    </w:p>
-  </w:footnote>
-  <w:footnote w:type="continuationSeparator" w:id="0">
-    <w:p>
-      <w:pPr>
-        <w:spacing w:after="0" w:line="240" w:lineRule="auto"/>
-      </w:pPr>
-      <w:r>
-        <w:rPr>
-          <w:rStyle w:val="FootnoteReference"/>
-        </w:rPr>
-        <w:footnoteRef/>
-      </w:r>
-      <w:r>
-        <w:continuationSeparator/>
-      </w:r>
-    </w:p>
-  </w:footnote>
-</w:footnotes>
-</file>
-
 <file path=word/numbering.xml><?xml version="1.0" encoding="utf-8"?>
-<w:numbering xmlns:wpc="http://schemas.microsoft.com/office/word/2010/wordprocessingCanvas" xmlns:mc="http://schemas.openxmlformats.org/markup-compatibility/2006" xmlns:o="urn:schemas-microsoft-com:office:office" xmlns:r="http://schemas.openxmlformats.org/officeDocument/2006/relationships" xmlns:m="http://schemas.openxmlformats.org/officeDocument/2006/math" xmlns:v="urn:schemas-microsoft-com:vml" xmlns:wp14="http://schemas.microsoft.com/office/word/2010/wordprocessingDrawing" xmlns:wp="http://schemas.openxmlformats.org/drawingml/2006/wordprocessingDrawing" xmlns:w10="urn:schemas-microsoft-com:office:word" xmlns:w="http://schemas.openxmlformats.org/wordprocessingml/2006/main" xmlns:w14="http://schemas.microsoft.com/office/word/2010/wordml" xmlns:w15="http://schemas.microsoft.com/office/word/2012/wordml" xmlns:wpg="http://schemas.microsoft.com/office/word/2010/wordprocessingGroup" xmlns:wpi="http://schemas.microsoft.com/office/word/2010/wordprocessingInk" xmlns:wne="http://schemas.microsoft.com/office/word/2006/wordml" xmlns:wps="http://schemas.microsoft.com/office/word/2010/wordprocessingShape" mc:Ignorable="w14 w15 wp14">
-  <w:abstractNum w:abstractNumId="1" w15:restartNumberingAfterBreak="0">
+<w:numbering xmlns:wpc="http://schemas.microsoft.com/office/word/2010/wordprocessingCanvas" xmlns:cx="http://schemas.microsoft.com/office/drawing/2014/chartex" xmlns:cx1="http://schemas.microsoft.com/office/drawing/2015/9/8/chartex" xmlns:cx2="http://schemas.microsoft.com/office/drawing/2015/10/21/chartex" xmlns:cx3="http://schemas.microsoft.com/office/drawing/2016/5/9/chartex" xmlns:cx4="http://schemas.microsoft.com/office/drawing/2016/5/10/chartex" xmlns:cx5="http://schemas.microsoft.com/office/drawing/2016/5/11/chartex" xmlns:cx6="http://schemas.microsoft.com/office/drawing/2016/5/12/chartex" xmlns:cx7="http://schemas.microsoft.com/office/drawing/2016/5/13/chartex" xmlns:cx8="http://schemas.microsoft.com/office/drawing/2016/5/14/chartex" xmlns:mc="http://schemas.openxmlformats.org/markup-compatibility/2006" xmlns:aink="http://schemas.microsoft.com/office/drawing/2016/ink" xmlns:am3d="http://schemas.microsoft.com/office/drawing/2017/model3d" xmlns:o="urn:schemas-microsoft-com:office:office" xmlns:r="http://schemas.openxmlformats.org/officeDocument/2006/relationships" xmlns:m="http://schemas.openxmlformats.org/officeDocument/2006/math" xmlns:v="urn:schemas-microsoft-com:vml" xmlns:wp14="http://schemas.microsoft.com/office/word/2010/wordprocessingDrawing" xmlns:wp="http://schemas.openxmlformats.org/drawingml/2006/wordprocessingDrawing" xmlns:w10="urn:schemas-microsoft-com:office:word" xmlns:w="http://schemas.openxmlformats.org/wordprocessingml/2006/main" xmlns:w14="http://schemas.microsoft.com/office/word/2010/wordml" xmlns:w15="http://schemas.microsoft.com/office/word/2012/wordml" xmlns:w16cid="http://schemas.microsoft.com/office/word/2016/wordml/cid" xmlns:w16se="http://schemas.microsoft.com/office/word/2015/wordml/symex" xmlns:wpg="http://schemas.microsoft.com/office/word/2010/wordprocessingGroup" xmlns:wpi="http://schemas.microsoft.com/office/word/2010/wordprocessingInk" xmlns:wne="http://schemas.microsoft.com/office/word/2006/wordml" xmlns:wps="http://schemas.microsoft.com/office/word/2010/wordprocessingShape" mc:Ignorable="w14 w15 w16se w16cid wp14">
+  <w:abstractNum w:abstractNumId="0" w15:restartNumberingAfterBreak="0">
+    <w:nsid w:val="1BC51CE1"/>
     <w:multiLevelType w:val="hybridMultilevel"/>
-    <w:lvl w:ilvl="0" w15:tentative="1">
+    <w:tmpl w:val="0F488EA2"/>
+    <w:lvl w:ilvl="0" w:tplc="4DC4AD28">
       <w:start w:val="1"/>
       <w:numFmt w:val="bullet"/>
       <w:lvlText w:val="●"/>
@@ -1608,7 +1937,7 @@
         <w:ind w:left="720" w:hanging="360"/>
       </w:pPr>
     </w:lvl>
-    <w:lvl w:ilvl="1" w15:tentative="1">
+    <w:lvl w:ilvl="1" w:tplc="6D9A42D2">
       <w:start w:val="1"/>
       <w:numFmt w:val="bullet"/>
       <w:lvlText w:val="○"/>
@@ -1617,7 +1946,7 @@
         <w:ind w:left="1440" w:hanging="360"/>
       </w:pPr>
     </w:lvl>
-    <w:lvl w:ilvl="2" w15:tentative="1">
+    <w:lvl w:ilvl="2" w:tplc="DE9ECFCC">
       <w:start w:val="1"/>
       <w:numFmt w:val="bullet"/>
       <w:lvlText w:val="■"/>
@@ -1626,7 +1955,7 @@
         <w:ind w:left="2160" w:hanging="360"/>
       </w:pPr>
     </w:lvl>
-    <w:lvl w:ilvl="3" w15:tentative="1">
+    <w:lvl w:ilvl="3" w:tplc="49B04872">
       <w:start w:val="1"/>
       <w:numFmt w:val="bullet"/>
       <w:lvlText w:val="●"/>
@@ -1635,7 +1964,7 @@
         <w:ind w:left="2880" w:hanging="360"/>
       </w:pPr>
     </w:lvl>
-    <w:lvl w:ilvl="4" w15:tentative="1">
+    <w:lvl w:ilvl="4" w:tplc="AAA05324">
       <w:start w:val="1"/>
       <w:numFmt w:val="bullet"/>
       <w:lvlText w:val="○"/>
@@ -1644,7 +1973,7 @@
         <w:ind w:left="3600" w:hanging="360"/>
       </w:pPr>
     </w:lvl>
-    <w:lvl w:ilvl="5" w15:tentative="1">
+    <w:lvl w:ilvl="5" w:tplc="FC9C9220">
       <w:start w:val="1"/>
       <w:numFmt w:val="bullet"/>
       <w:lvlText w:val="■"/>
@@ -1653,7 +1982,7 @@
         <w:ind w:left="4320" w:hanging="360"/>
       </w:pPr>
     </w:lvl>
-    <w:lvl w:ilvl="6" w15:tentative="1">
+    <w:lvl w:ilvl="6" w:tplc="3CBEB67E">
       <w:start w:val="1"/>
       <w:numFmt w:val="bullet"/>
       <w:lvlText w:val="●"/>
@@ -1662,7 +1991,7 @@
         <w:ind w:left="5040" w:hanging="360"/>
       </w:pPr>
     </w:lvl>
-    <w:lvl w:ilvl="7" w15:tentative="1">
+    <w:lvl w:ilvl="7" w:tplc="9FF28AC0">
       <w:start w:val="1"/>
       <w:numFmt w:val="bullet"/>
       <w:lvlText w:val="●"/>
@@ -1671,7 +2000,7 @@
         <w:ind w:left="5760" w:hanging="360"/>
       </w:pPr>
     </w:lvl>
-    <w:lvl w:ilvl="8" w15:tentative="1">
+    <w:lvl w:ilvl="8" w:tplc="595CA0E8">
       <w:start w:val="1"/>
       <w:numFmt w:val="bullet"/>
       <w:lvlText w:val="●"/>
@@ -1681,9 +2010,11 @@
       </w:pPr>
     </w:lvl>
   </w:abstractNum>
-  <w:abstractNum w:abstractNumId="2" w15:restartNumberingAfterBreak="0">
+  <w:abstractNum w:abstractNumId="1" w15:restartNumberingAfterBreak="0">
+    <w:nsid w:val="46463130"/>
     <w:multiLevelType w:val="hybridMultilevel"/>
-    <w:lvl w:ilvl="0" w15:tentative="1">
+    <w:tmpl w:val="7D88272A"/>
+    <w:lvl w:ilvl="0" w:tplc="D814FC56">
       <w:start w:val="1"/>
       <w:numFmt w:val="bullet"/>
       <w:lvlText w:val="•"/>
@@ -1692,15 +2023,55 @@
         <w:ind w:left="360" w:hanging="260"/>
       </w:pPr>
     </w:lvl>
+    <w:lvl w:ilvl="1" w:tplc="38600980">
+      <w:numFmt w:val="decimal"/>
+      <w:lvlText w:val=""/>
+      <w:lvlJc w:val="left"/>
+    </w:lvl>
+    <w:lvl w:ilvl="2" w:tplc="C2E2E606">
+      <w:numFmt w:val="decimal"/>
+      <w:lvlText w:val=""/>
+      <w:lvlJc w:val="left"/>
+    </w:lvl>
+    <w:lvl w:ilvl="3" w:tplc="F27E8DE0">
+      <w:numFmt w:val="decimal"/>
+      <w:lvlText w:val=""/>
+      <w:lvlJc w:val="left"/>
+    </w:lvl>
+    <w:lvl w:ilvl="4" w:tplc="70C47EEC">
+      <w:numFmt w:val="decimal"/>
+      <w:lvlText w:val=""/>
+      <w:lvlJc w:val="left"/>
+    </w:lvl>
+    <w:lvl w:ilvl="5" w:tplc="86CA770C">
+      <w:numFmt w:val="decimal"/>
+      <w:lvlText w:val=""/>
+      <w:lvlJc w:val="left"/>
+    </w:lvl>
+    <w:lvl w:ilvl="6" w:tplc="9CA8687E">
+      <w:numFmt w:val="decimal"/>
+      <w:lvlText w:val=""/>
+      <w:lvlJc w:val="left"/>
+    </w:lvl>
+    <w:lvl w:ilvl="7" w:tplc="2110B2C2">
+      <w:numFmt w:val="decimal"/>
+      <w:lvlText w:val=""/>
+      <w:lvlJc w:val="left"/>
+    </w:lvl>
+    <w:lvl w:ilvl="8" w:tplc="6B84372C">
+      <w:numFmt w:val="decimal"/>
+      <w:lvlText w:val=""/>
+      <w:lvlJc w:val="left"/>
+    </w:lvl>
   </w:abstractNum>
   <w:num w:numId="1">
-    <w:abstractNumId w:val="1"/>
+    <w:abstractNumId w:val="0"/>
     <w:lvlOverride w:ilvl="0">
       <w:startOverride w:val="1"/>
     </w:lvlOverride>
   </w:num>
   <w:num w:numId="2">
-    <w:abstractNumId w:val="2"/>
+    <w:abstractNumId w:val="1"/>
     <w:lvlOverride w:ilvl="0">
       <w:startOverride w:val="1"/>
     </w:lvlOverride>
@@ -1709,26 +2080,407 @@
 </file>
 
 <file path=word/styles.xml><?xml version="1.0" encoding="utf-8"?>
-<w:styles xmlns:mc="http://schemas.openxmlformats.org/markup-compatibility/2006" xmlns:r="http://schemas.openxmlformats.org/officeDocument/2006/relationships" xmlns:w="http://schemas.openxmlformats.org/wordprocessingml/2006/main" xmlns:w14="http://schemas.microsoft.com/office/word/2010/wordml" xmlns:w15="http://schemas.microsoft.com/office/word/2012/wordml" mc:Ignorable="w14 w15">
+<w:styles xmlns:mc="http://schemas.openxmlformats.org/markup-compatibility/2006" xmlns:r="http://schemas.openxmlformats.org/officeDocument/2006/relationships" xmlns:w="http://schemas.openxmlformats.org/wordprocessingml/2006/main" xmlns:w14="http://schemas.microsoft.com/office/word/2010/wordml" xmlns:w15="http://schemas.microsoft.com/office/word/2012/wordml" xmlns:w16cid="http://schemas.microsoft.com/office/word/2016/wordml/cid" xmlns:w16se="http://schemas.microsoft.com/office/word/2015/wordml/symex" mc:Ignorable="w14 w15 w16se w16cid">
   <w:docDefaults>
-    <w:rPrDefault/>
+    <w:rPrDefault>
+      <w:rPr>
+        <w:rFonts w:ascii="Times New Roman" w:eastAsia="Times New Roman" w:hAnsi="Times New Roman" w:cs="Times New Roman"/>
+        <w:lang w:val="en-GB" w:eastAsia="en-GB" w:bidi="ne-NP"/>
+      </w:rPr>
+    </w:rPrDefault>
     <w:pPrDefault/>
   </w:docDefaults>
-  <w:style w:type="paragraph" w:styleId="Title">
-    <w:name w:val="Title"/>
-    <w:basedOn w:val="Normal"/>
-    <w:next w:val="Normal"/>
+  <w:latentStyles w:defLockedState="0" w:defUIPriority="99" w:defSemiHidden="0" w:defUnhideWhenUsed="0" w:defQFormat="0" w:count="375">
+    <w:lsdException w:name="Normal" w:uiPriority="0" w:qFormat="1"/>
+    <w:lsdException w:name="heading 1" w:uiPriority="9" w:qFormat="1"/>
+    <w:lsdException w:name="heading 2" w:semiHidden="1" w:uiPriority="9" w:unhideWhenUsed="1" w:qFormat="1"/>
+    <w:lsdException w:name="heading 3" w:semiHidden="1" w:uiPriority="9" w:unhideWhenUsed="1" w:qFormat="1"/>
+    <w:lsdException w:name="heading 4" w:semiHidden="1" w:uiPriority="9" w:unhideWhenUsed="1" w:qFormat="1"/>
+    <w:lsdException w:name="heading 5" w:semiHidden="1" w:uiPriority="9" w:unhideWhenUsed="1" w:qFormat="1"/>
+    <w:lsdException w:name="heading 6" w:semiHidden="1" w:uiPriority="9" w:unhideWhenUsed="1" w:qFormat="1"/>
+    <w:lsdException w:name="heading 7" w:semiHidden="1" w:uiPriority="9" w:unhideWhenUsed="1" w:qFormat="1"/>
+    <w:lsdException w:name="heading 8" w:semiHidden="1" w:uiPriority="9" w:unhideWhenUsed="1" w:qFormat="1"/>
+    <w:lsdException w:name="heading 9" w:semiHidden="1" w:uiPriority="9" w:unhideWhenUsed="1" w:qFormat="1"/>
+    <w:lsdException w:name="index 1" w:semiHidden="1" w:unhideWhenUsed="1"/>
+    <w:lsdException w:name="index 2" w:semiHidden="1" w:unhideWhenUsed="1"/>
+    <w:lsdException w:name="index 3" w:semiHidden="1" w:unhideWhenUsed="1"/>
+    <w:lsdException w:name="index 4" w:semiHidden="1" w:unhideWhenUsed="1"/>
+    <w:lsdException w:name="index 5" w:semiHidden="1" w:unhideWhenUsed="1"/>
+    <w:lsdException w:name="index 6" w:semiHidden="1" w:unhideWhenUsed="1"/>
+    <w:lsdException w:name="index 7" w:semiHidden="1" w:unhideWhenUsed="1"/>
+    <w:lsdException w:name="index 8" w:semiHidden="1" w:unhideWhenUsed="1"/>
+    <w:lsdException w:name="index 9" w:semiHidden="1" w:unhideWhenUsed="1"/>
+    <w:lsdException w:name="toc 1" w:semiHidden="1" w:uiPriority="39" w:unhideWhenUsed="1"/>
+    <w:lsdException w:name="toc 2" w:semiHidden="1" w:uiPriority="39" w:unhideWhenUsed="1"/>
+    <w:lsdException w:name="toc 3" w:semiHidden="1" w:uiPriority="39" w:unhideWhenUsed="1"/>
+    <w:lsdException w:name="toc 4" w:semiHidden="1" w:uiPriority="39" w:unhideWhenUsed="1"/>
+    <w:lsdException w:name="toc 5" w:semiHidden="1" w:uiPriority="39" w:unhideWhenUsed="1"/>
+    <w:lsdException w:name="toc 6" w:semiHidden="1" w:uiPriority="39" w:unhideWhenUsed="1"/>
+    <w:lsdException w:name="toc 7" w:semiHidden="1" w:uiPriority="39" w:unhideWhenUsed="1"/>
+    <w:lsdException w:name="toc 8" w:semiHidden="1" w:uiPriority="39" w:unhideWhenUsed="1"/>
+    <w:lsdException w:name="toc 9" w:semiHidden="1" w:uiPriority="39" w:unhideWhenUsed="1"/>
+    <w:lsdException w:name="Normal Indent" w:semiHidden="1" w:unhideWhenUsed="1"/>
+    <w:lsdException w:name="footnote text" w:semiHidden="1" w:unhideWhenUsed="1"/>
+    <w:lsdException w:name="annotation text" w:semiHidden="1" w:unhideWhenUsed="1"/>
+    <w:lsdException w:name="header" w:semiHidden="1" w:unhideWhenUsed="1"/>
+    <w:lsdException w:name="footer" w:semiHidden="1" w:unhideWhenUsed="1"/>
+    <w:lsdException w:name="index heading" w:semiHidden="1" w:unhideWhenUsed="1"/>
+    <w:lsdException w:name="caption" w:semiHidden="1" w:uiPriority="35" w:unhideWhenUsed="1" w:qFormat="1"/>
+    <w:lsdException w:name="table of figures" w:semiHidden="1" w:unhideWhenUsed="1"/>
+    <w:lsdException w:name="envelope address" w:semiHidden="1" w:unhideWhenUsed="1"/>
+    <w:lsdException w:name="envelope return" w:semiHidden="1" w:unhideWhenUsed="1"/>
+    <w:lsdException w:name="footnote reference" w:semiHidden="1" w:unhideWhenUsed="1"/>
+    <w:lsdException w:name="annotation reference" w:semiHidden="1" w:unhideWhenUsed="1"/>
+    <w:lsdException w:name="line number" w:semiHidden="1" w:unhideWhenUsed="1"/>
+    <w:lsdException w:name="page number" w:semiHidden="1" w:unhideWhenUsed="1"/>
+    <w:lsdException w:name="endnote reference" w:semiHidden="1" w:unhideWhenUsed="1"/>
+    <w:lsdException w:name="endnote text" w:semiHidden="1" w:unhideWhenUsed="1"/>
+    <w:lsdException w:name="table of authorities" w:semiHidden="1" w:unhideWhenUsed="1"/>
+    <w:lsdException w:name="macro" w:semiHidden="1" w:unhideWhenUsed="1"/>
+    <w:lsdException w:name="toa heading" w:semiHidden="1" w:unhideWhenUsed="1"/>
+    <w:lsdException w:name="List" w:semiHidden="1" w:unhideWhenUsed="1"/>
+    <w:lsdException w:name="List Bullet" w:semiHidden="1" w:unhideWhenUsed="1"/>
+    <w:lsdException w:name="List Number" w:semiHidden="1" w:unhideWhenUsed="1"/>
+    <w:lsdException w:name="List 2" w:semiHidden="1" w:unhideWhenUsed="1"/>
+    <w:lsdException w:name="List 3" w:semiHidden="1" w:unhideWhenUsed="1"/>
+    <w:lsdException w:name="List 4" w:semiHidden="1" w:unhideWhenUsed="1"/>
+    <w:lsdException w:name="List 5" w:semiHidden="1" w:unhideWhenUsed="1"/>
+    <w:lsdException w:name="List Bullet 2" w:semiHidden="1" w:unhideWhenUsed="1"/>
+    <w:lsdException w:name="List Bullet 3" w:semiHidden="1" w:unhideWhenUsed="1"/>
+    <w:lsdException w:name="List Bullet 4" w:semiHidden="1" w:unhideWhenUsed="1"/>
+    <w:lsdException w:name="List Bullet 5" w:semiHidden="1" w:unhideWhenUsed="1"/>
+    <w:lsdException w:name="List Number 2" w:semiHidden="1" w:unhideWhenUsed="1"/>
+    <w:lsdException w:name="List Number 3" w:semiHidden="1" w:unhideWhenUsed="1"/>
+    <w:lsdException w:name="List Number 4" w:semiHidden="1" w:unhideWhenUsed="1"/>
+    <w:lsdException w:name="List Number 5" w:semiHidden="1" w:unhideWhenUsed="1"/>
+    <w:lsdException w:name="Title" w:uiPriority="10" w:qFormat="1"/>
+    <w:lsdException w:name="Closing" w:semiHidden="1" w:unhideWhenUsed="1"/>
+    <w:lsdException w:name="Signature" w:semiHidden="1" w:unhideWhenUsed="1"/>
+    <w:lsdException w:name="Default Paragraph Font" w:semiHidden="1" w:uiPriority="1" w:unhideWhenUsed="1"/>
+    <w:lsdException w:name="Body Text" w:semiHidden="1" w:unhideWhenUsed="1"/>
+    <w:lsdException w:name="Body Text Indent" w:semiHidden="1" w:unhideWhenUsed="1"/>
+    <w:lsdException w:name="List Continue" w:semiHidden="1" w:unhideWhenUsed="1"/>
+    <w:lsdException w:name="List Continue 2" w:semiHidden="1" w:unhideWhenUsed="1"/>
+    <w:lsdException w:name="List Continue 3" w:semiHidden="1" w:unhideWhenUsed="1"/>
+    <w:lsdException w:name="List Continue 4" w:semiHidden="1" w:unhideWhenUsed="1"/>
+    <w:lsdException w:name="List Continue 5" w:semiHidden="1" w:unhideWhenUsed="1"/>
+    <w:lsdException w:name="Message Header" w:semiHidden="1" w:unhideWhenUsed="1"/>
+    <w:lsdException w:name="Subtitle" w:uiPriority="11" w:qFormat="1"/>
+    <w:lsdException w:name="Salutation" w:semiHidden="1" w:unhideWhenUsed="1"/>
+    <w:lsdException w:name="Date" w:semiHidden="1" w:unhideWhenUsed="1"/>
+    <w:lsdException w:name="Body Text First Indent" w:semiHidden="1" w:unhideWhenUsed="1"/>
+    <w:lsdException w:name="Body Text First Indent 2" w:semiHidden="1" w:unhideWhenUsed="1"/>
+    <w:lsdException w:name="Note Heading" w:semiHidden="1" w:unhideWhenUsed="1"/>
+    <w:lsdException w:name="Body Text 2" w:semiHidden="1" w:unhideWhenUsed="1"/>
+    <w:lsdException w:name="Body Text 3" w:semiHidden="1" w:unhideWhenUsed="1"/>
+    <w:lsdException w:name="Body Text Indent 2" w:semiHidden="1" w:unhideWhenUsed="1"/>
+    <w:lsdException w:name="Body Text Indent 3" w:semiHidden="1" w:unhideWhenUsed="1"/>
+    <w:lsdException w:name="Block Text" w:semiHidden="1" w:unhideWhenUsed="1"/>
+    <w:lsdException w:name="Hyperlink" w:semiHidden="1" w:unhideWhenUsed="1"/>
+    <w:lsdException w:name="FollowedHyperlink" w:semiHidden="1" w:unhideWhenUsed="1"/>
+    <w:lsdException w:name="Strong" w:uiPriority="22" w:qFormat="1"/>
+    <w:lsdException w:name="Emphasis" w:uiPriority="20" w:qFormat="1"/>
+    <w:lsdException w:name="Document Map" w:semiHidden="1" w:unhideWhenUsed="1"/>
+    <w:lsdException w:name="Plain Text" w:semiHidden="1" w:unhideWhenUsed="1"/>
+    <w:lsdException w:name="E-mail Signature" w:semiHidden="1" w:unhideWhenUsed="1"/>
+    <w:lsdException w:name="HTML Top of Form" w:semiHidden="1" w:unhideWhenUsed="1"/>
+    <w:lsdException w:name="HTML Bottom of Form" w:semiHidden="1" w:unhideWhenUsed="1"/>
+    <w:lsdException w:name="Normal (Web)" w:semiHidden="1" w:unhideWhenUsed="1"/>
+    <w:lsdException w:name="HTML Acronym" w:semiHidden="1" w:unhideWhenUsed="1"/>
+    <w:lsdException w:name="HTML Address" w:semiHidden="1" w:unhideWhenUsed="1"/>
+    <w:lsdException w:name="HTML Cite" w:semiHidden="1" w:unhideWhenUsed="1"/>
+    <w:lsdException w:name="HTML Code" w:semiHidden="1" w:unhideWhenUsed="1"/>
+    <w:lsdException w:name="HTML Definition" w:semiHidden="1" w:unhideWhenUsed="1"/>
+    <w:lsdException w:name="HTML Keyboard" w:semiHidden="1" w:unhideWhenUsed="1"/>
+    <w:lsdException w:name="HTML Preformatted" w:semiHidden="1" w:unhideWhenUsed="1"/>
+    <w:lsdException w:name="HTML Sample" w:semiHidden="1" w:unhideWhenUsed="1"/>
+    <w:lsdException w:name="HTML Typewriter" w:semiHidden="1" w:unhideWhenUsed="1"/>
+    <w:lsdException w:name="HTML Variable" w:semiHidden="1" w:unhideWhenUsed="1"/>
+    <w:lsdException w:name="Normal Table" w:semiHidden="1" w:unhideWhenUsed="1"/>
+    <w:lsdException w:name="annotation subject" w:semiHidden="1" w:unhideWhenUsed="1"/>
+    <w:lsdException w:name="No List" w:semiHidden="1" w:unhideWhenUsed="1"/>
+    <w:lsdException w:name="Outline List 1" w:semiHidden="1" w:unhideWhenUsed="1"/>
+    <w:lsdException w:name="Outline List 2" w:semiHidden="1" w:unhideWhenUsed="1"/>
+    <w:lsdException w:name="Outline List 3" w:semiHidden="1" w:unhideWhenUsed="1"/>
+    <w:lsdException w:name="Table Simple 1" w:semiHidden="1" w:unhideWhenUsed="1"/>
+    <w:lsdException w:name="Table Simple 2" w:semiHidden="1" w:unhideWhenUsed="1"/>
+    <w:lsdException w:name="Table Simple 3" w:semiHidden="1" w:unhideWhenUsed="1"/>
+    <w:lsdException w:name="Table Classic 1" w:semiHidden="1" w:unhideWhenUsed="1"/>
+    <w:lsdException w:name="Table Classic 2" w:semiHidden="1" w:unhideWhenUsed="1"/>
+    <w:lsdException w:name="Table Classic 3" w:semiHidden="1" w:unhideWhenUsed="1"/>
+    <w:lsdException w:name="Table Classic 4" w:semiHidden="1" w:unhideWhenUsed="1"/>
+    <w:lsdException w:name="Table Colorful 1" w:semiHidden="1" w:unhideWhenUsed="1"/>
+    <w:lsdException w:name="Table Colorful 2" w:semiHidden="1" w:unhideWhenUsed="1"/>
+    <w:lsdException w:name="Table Colorful 3" w:semiHidden="1" w:unhideWhenUsed="1"/>
+    <w:lsdException w:name="Table Columns 1" w:semiHidden="1" w:unhideWhenUsed="1"/>
+    <w:lsdException w:name="Table Columns 2" w:semiHidden="1" w:unhideWhenUsed="1"/>
+    <w:lsdException w:name="Table Columns 3" w:semiHidden="1" w:unhideWhenUsed="1"/>
+    <w:lsdException w:name="Table Columns 4" w:semiHidden="1" w:unhideWhenUsed="1"/>
+    <w:lsdException w:name="Table Columns 5" w:semiHidden="1" w:unhideWhenUsed="1"/>
+    <w:lsdException w:name="Table Grid 1" w:semiHidden="1" w:unhideWhenUsed="1"/>
+    <w:lsdException w:name="Table Grid 2" w:semiHidden="1" w:unhideWhenUsed="1"/>
+    <w:lsdException w:name="Table Grid 3" w:semiHidden="1" w:unhideWhenUsed="1"/>
+    <w:lsdException w:name="Table Grid 4" w:semiHidden="1" w:unhideWhenUsed="1"/>
+    <w:lsdException w:name="Table Grid 5" w:semiHidden="1" w:unhideWhenUsed="1"/>
+    <w:lsdException w:name="Table Grid 6" w:semiHidden="1" w:unhideWhenUsed="1"/>
+    <w:lsdException w:name="Table Grid 7" w:semiHidden="1" w:unhideWhenUsed="1"/>
+    <w:lsdException w:name="Table Grid 8" w:semiHidden="1" w:unhideWhenUsed="1"/>
+    <w:lsdException w:name="Table List 1" w:semiHidden="1" w:unhideWhenUsed="1"/>
+    <w:lsdException w:name="Table List 2" w:semiHidden="1" w:unhideWhenUsed="1"/>
+    <w:lsdException w:name="Table List 3" w:semiHidden="1" w:unhideWhenUsed="1"/>
+    <w:lsdException w:name="Table List 4" w:semiHidden="1" w:unhideWhenUsed="1"/>
+    <w:lsdException w:name="Table List 5" w:semiHidden="1" w:unhideWhenUsed="1"/>
+    <w:lsdException w:name="Table List 6" w:semiHidden="1" w:unhideWhenUsed="1"/>
+    <w:lsdException w:name="Table List 7" w:semiHidden="1" w:unhideWhenUsed="1"/>
+    <w:lsdException w:name="Table List 8" w:semiHidden="1" w:unhideWhenUsed="1"/>
+    <w:lsdException w:name="Table 3D effects 1" w:semiHidden="1" w:unhideWhenUsed="1"/>
+    <w:lsdException w:name="Table 3D effects 2" w:semiHidden="1" w:unhideWhenUsed="1"/>
+    <w:lsdException w:name="Table 3D effects 3" w:semiHidden="1" w:unhideWhenUsed="1"/>
+    <w:lsdException w:name="Table Contemporary" w:semiHidden="1" w:unhideWhenUsed="1"/>
+    <w:lsdException w:name="Table Elegant" w:semiHidden="1" w:unhideWhenUsed="1"/>
+    <w:lsdException w:name="Table Professional" w:semiHidden="1" w:unhideWhenUsed="1"/>
+    <w:lsdException w:name="Table Subtle 1" w:semiHidden="1" w:unhideWhenUsed="1"/>
+    <w:lsdException w:name="Table Subtle 2" w:semiHidden="1" w:unhideWhenUsed="1"/>
+    <w:lsdException w:name="Table Web 1" w:semiHidden="1" w:unhideWhenUsed="1"/>
+    <w:lsdException w:name="Table Web 2" w:semiHidden="1" w:unhideWhenUsed="1"/>
+    <w:lsdException w:name="Table Web 3" w:semiHidden="1" w:unhideWhenUsed="1"/>
+    <w:lsdException w:name="Balloon Text" w:semiHidden="1" w:unhideWhenUsed="1"/>
+    <w:lsdException w:name="Table Grid" w:uiPriority="39"/>
+    <w:lsdException w:name="Table Theme" w:semiHidden="1" w:unhideWhenUsed="1"/>
+    <w:lsdException w:name="Placeholder Text" w:semiHidden="1"/>
+    <w:lsdException w:name="No Spacing" w:uiPriority="1" w:qFormat="1"/>
+    <w:lsdException w:name="Light Shading" w:uiPriority="60"/>
+    <w:lsdException w:name="Light List" w:uiPriority="61"/>
+    <w:lsdException w:name="Light Grid" w:uiPriority="62"/>
+    <w:lsdException w:name="Medium Shading 1" w:uiPriority="63"/>
+    <w:lsdException w:name="Medium Shading 2" w:uiPriority="64"/>
+    <w:lsdException w:name="Medium List 1" w:uiPriority="65"/>
+    <w:lsdException w:name="Medium List 2" w:uiPriority="66"/>
+    <w:lsdException w:name="Medium Grid 1" w:uiPriority="67"/>
+    <w:lsdException w:name="Medium Grid 2" w:uiPriority="68"/>
+    <w:lsdException w:name="Medium Grid 3" w:uiPriority="69"/>
+    <w:lsdException w:name="Dark List" w:uiPriority="70"/>
+    <w:lsdException w:name="Colorful Shading" w:uiPriority="71"/>
+    <w:lsdException w:name="Colorful List" w:uiPriority="72"/>
+    <w:lsdException w:name="Colorful Grid" w:uiPriority="73"/>
+    <w:lsdException w:name="Light Shading Accent 1" w:uiPriority="60"/>
+    <w:lsdException w:name="Light List Accent 1" w:uiPriority="61"/>
+    <w:lsdException w:name="Light Grid Accent 1" w:uiPriority="62"/>
+    <w:lsdException w:name="Medium Shading 1 Accent 1" w:uiPriority="63"/>
+    <w:lsdException w:name="Medium Shading 2 Accent 1" w:uiPriority="64"/>
+    <w:lsdException w:name="Medium List 1 Accent 1" w:uiPriority="65"/>
+    <w:lsdException w:name="Revision" w:semiHidden="1"/>
+    <w:lsdException w:name="List Paragraph" w:uiPriority="34" w:qFormat="1"/>
+    <w:lsdException w:name="Quote" w:uiPriority="29" w:qFormat="1"/>
+    <w:lsdException w:name="Intense Quote" w:uiPriority="30" w:qFormat="1"/>
+    <w:lsdException w:name="Medium List 2 Accent 1" w:uiPriority="66"/>
+    <w:lsdException w:name="Medium Grid 1 Accent 1" w:uiPriority="67"/>
+    <w:lsdException w:name="Medium Grid 2 Accent 1" w:uiPriority="68"/>
+    <w:lsdException w:name="Medium Grid 3 Accent 1" w:uiPriority="69"/>
+    <w:lsdException w:name="Dark List Accent 1" w:uiPriority="70"/>
+    <w:lsdException w:name="Colorful Shading Accent 1" w:uiPriority="71"/>
+    <w:lsdException w:name="Colorful List Accent 1" w:uiPriority="72"/>
+    <w:lsdException w:name="Colorful Grid Accent 1" w:uiPriority="73"/>
+    <w:lsdException w:name="Light Shading Accent 2" w:uiPriority="60"/>
+    <w:lsdException w:name="Light List Accent 2" w:uiPriority="61"/>
+    <w:lsdException w:name="Light Grid Accent 2" w:uiPriority="62"/>
+    <w:lsdException w:name="Medium Shading 1 Accent 2" w:uiPriority="63"/>
+    <w:lsdException w:name="Medium Shading 2 Accent 2" w:uiPriority="64"/>
+    <w:lsdException w:name="Medium List 1 Accent 2" w:uiPriority="65"/>
+    <w:lsdException w:name="Medium List 2 Accent 2" w:uiPriority="66"/>
+    <w:lsdException w:name="Medium Grid 1 Accent 2" w:uiPriority="67"/>
+    <w:lsdException w:name="Medium Grid 2 Accent 2" w:uiPriority="68"/>
+    <w:lsdException w:name="Medium Grid 3 Accent 2" w:uiPriority="69"/>
+    <w:lsdException w:name="Dark List Accent 2" w:uiPriority="70"/>
+    <w:lsdException w:name="Colorful Shading Accent 2" w:uiPriority="71"/>
+    <w:lsdException w:name="Colorful List Accent 2" w:uiPriority="72"/>
+    <w:lsdException w:name="Colorful Grid Accent 2" w:uiPriority="73"/>
+    <w:lsdException w:name="Light Shading Accent 3" w:uiPriority="60"/>
+    <w:lsdException w:name="Light List Accent 3" w:uiPriority="61"/>
+    <w:lsdException w:name="Light Grid Accent 3" w:uiPriority="62"/>
+    <w:lsdException w:name="Medium Shading 1 Accent 3" w:uiPriority="63"/>
+    <w:lsdException w:name="Medium Shading 2 Accent 3" w:uiPriority="64"/>
+    <w:lsdException w:name="Medium List 1 Accent 3" w:uiPriority="65"/>
+    <w:lsdException w:name="Medium List 2 Accent 3" w:uiPriority="66"/>
+    <w:lsdException w:name="Medium Grid 1 Accent 3" w:uiPriority="67"/>
+    <w:lsdException w:name="Medium Grid 2 Accent 3" w:uiPriority="68"/>
+    <w:lsdException w:name="Medium Grid 3 Accent 3" w:uiPriority="69"/>
+    <w:lsdException w:name="Dark List Accent 3" w:uiPriority="70"/>
+    <w:lsdException w:name="Colorful Shading Accent 3" w:uiPriority="71"/>
+    <w:lsdException w:name="Colorful List Accent 3" w:uiPriority="72"/>
+    <w:lsdException w:name="Colorful Grid Accent 3" w:uiPriority="73"/>
+    <w:lsdException w:name="Light Shading Accent 4" w:uiPriority="60"/>
+    <w:lsdException w:name="Light List Accent 4" w:uiPriority="61"/>
+    <w:lsdException w:name="Light Grid Accent 4" w:uiPriority="62"/>
+    <w:lsdException w:name="Medium Shading 1 Accent 4" w:uiPriority="63"/>
+    <w:lsdException w:name="Medium Shading 2 Accent 4" w:uiPriority="64"/>
+    <w:lsdException w:name="Medium List 1 Accent 4" w:uiPriority="65"/>
+    <w:lsdException w:name="Medium List 2 Accent 4" w:uiPriority="66"/>
+    <w:lsdException w:name="Medium Grid 1 Accent 4" w:uiPriority="67"/>
+    <w:lsdException w:name="Medium Grid 2 Accent 4" w:uiPriority="68"/>
+    <w:lsdException w:name="Medium Grid 3 Accent 4" w:uiPriority="69"/>
+    <w:lsdException w:name="Dark List Accent 4" w:uiPriority="70"/>
+    <w:lsdException w:name="Colorful Shading Accent 4" w:uiPriority="71"/>
+    <w:lsdException w:name="Colorful List Accent 4" w:uiPriority="72"/>
+    <w:lsdException w:name="Colorful Grid Accent 4" w:uiPriority="73"/>
+    <w:lsdException w:name="Light Shading Accent 5" w:uiPriority="60"/>
+    <w:lsdException w:name="Light List Accent 5" w:uiPriority="61"/>
+    <w:lsdException w:name="Light Grid Accent 5" w:uiPriority="62"/>
+    <w:lsdException w:name="Medium Shading 1 Accent 5" w:uiPriority="63"/>
+    <w:lsdException w:name="Medium Shading 2 Accent 5" w:uiPriority="64"/>
+    <w:lsdException w:name="Medium List 1 Accent 5" w:uiPriority="65"/>
+    <w:lsdException w:name="Medium List 2 Accent 5" w:uiPriority="66"/>
+    <w:lsdException w:name="Medium Grid 1 Accent 5" w:uiPriority="67"/>
+    <w:lsdException w:name="Medium Grid 2 Accent 5" w:uiPriority="68"/>
+    <w:lsdException w:name="Medium Grid 3 Accent 5" w:uiPriority="69"/>
+    <w:lsdException w:name="Dark List Accent 5" w:uiPriority="70"/>
+    <w:lsdException w:name="Colorful Shading Accent 5" w:uiPriority="71"/>
+    <w:lsdException w:name="Colorful List Accent 5" w:uiPriority="72"/>
+    <w:lsdException w:name="Colorful Grid Accent 5" w:uiPriority="73"/>
+    <w:lsdException w:name="Light Shading Accent 6" w:uiPriority="60"/>
+    <w:lsdException w:name="Light List Accent 6" w:uiPriority="61"/>
+    <w:lsdException w:name="Light Grid Accent 6" w:uiPriority="62"/>
+    <w:lsdException w:name="Medium Shading 1 Accent 6" w:uiPriority="63"/>
+    <w:lsdException w:name="Medium Shading 2 Accent 6" w:uiPriority="64"/>
+    <w:lsdException w:name="Medium List 1 Accent 6" w:uiPriority="65"/>
+    <w:lsdException w:name="Medium List 2 Accent 6" w:uiPriority="66"/>
+    <w:lsdException w:name="Medium Grid 1 Accent 6" w:uiPriority="67"/>
+    <w:lsdException w:name="Medium Grid 2 Accent 6" w:uiPriority="68"/>
+    <w:lsdException w:name="Medium Grid 3 Accent 6" w:uiPriority="69"/>
+    <w:lsdException w:name="Dark List Accent 6" w:uiPriority="70"/>
+    <w:lsdException w:name="Colorful Shading Accent 6" w:uiPriority="71"/>
+    <w:lsdException w:name="Colorful List Accent 6" w:uiPriority="72"/>
+    <w:lsdException w:name="Colorful Grid Accent 6" w:uiPriority="73"/>
+    <w:lsdException w:name="Subtle Emphasis" w:uiPriority="19" w:qFormat="1"/>
+    <w:lsdException w:name="Intense Emphasis" w:uiPriority="21" w:qFormat="1"/>
+    <w:lsdException w:name="Subtle Reference" w:uiPriority="31" w:qFormat="1"/>
+    <w:lsdException w:name="Intense Reference" w:uiPriority="32" w:qFormat="1"/>
+    <w:lsdException w:name="Book Title" w:uiPriority="33" w:qFormat="1"/>
+    <w:lsdException w:name="Bibliography" w:semiHidden="1" w:uiPriority="37" w:unhideWhenUsed="1"/>
+    <w:lsdException w:name="TOC Heading" w:semiHidden="1" w:uiPriority="39" w:unhideWhenUsed="1" w:qFormat="1"/>
+    <w:lsdException w:name="Plain Table 1" w:uiPriority="41"/>
+    <w:lsdException w:name="Plain Table 2" w:uiPriority="42"/>
+    <w:lsdException w:name="Plain Table 3" w:uiPriority="43"/>
+    <w:lsdException w:name="Plain Table 4" w:uiPriority="44"/>
+    <w:lsdException w:name="Plain Table 5" w:uiPriority="45"/>
+    <w:lsdException w:name="Grid Table Light" w:uiPriority="40"/>
+    <w:lsdException w:name="Grid Table 1 Light" w:uiPriority="46"/>
+    <w:lsdException w:name="Grid Table 2" w:uiPriority="47"/>
+    <w:lsdException w:name="Grid Table 3" w:uiPriority="48"/>
+    <w:lsdException w:name="Grid Table 4" w:uiPriority="49"/>
+    <w:lsdException w:name="Grid Table 5 Dark" w:uiPriority="50"/>
+    <w:lsdException w:name="Grid Table 6 Colorful" w:uiPriority="51"/>
+    <w:lsdException w:name="Grid Table 7 Colorful" w:uiPriority="52"/>
+    <w:lsdException w:name="Grid Table 1 Light Accent 1" w:uiPriority="46"/>
+    <w:lsdException w:name="Grid Table 2 Accent 1" w:uiPriority="47"/>
+    <w:lsdException w:name="Grid Table 3 Accent 1" w:uiPriority="48"/>
+    <w:lsdException w:name="Grid Table 4 Accent 1" w:uiPriority="49"/>
+    <w:lsdException w:name="Grid Table 5 Dark Accent 1" w:uiPriority="50"/>
+    <w:lsdException w:name="Grid Table 6 Colorful Accent 1" w:uiPriority="51"/>
+    <w:lsdException w:name="Grid Table 7 Colorful Accent 1" w:uiPriority="52"/>
+    <w:lsdException w:name="Grid Table 1 Light Accent 2" w:uiPriority="46"/>
+    <w:lsdException w:name="Grid Table 2 Accent 2" w:uiPriority="47"/>
+    <w:lsdException w:name="Grid Table 3 Accent 2" w:uiPriority="48"/>
+    <w:lsdException w:name="Grid Table 4 Accent 2" w:uiPriority="49"/>
+    <w:lsdException w:name="Grid Table 5 Dark Accent 2" w:uiPriority="50"/>
+    <w:lsdException w:name="Grid Table 6 Colorful Accent 2" w:uiPriority="51"/>
+    <w:lsdException w:name="Grid Table 7 Colorful Accent 2" w:uiPriority="52"/>
+    <w:lsdException w:name="Grid Table 1 Light Accent 3" w:uiPriority="46"/>
+    <w:lsdException w:name="Grid Table 2 Accent 3" w:uiPriority="47"/>
+    <w:lsdException w:name="Grid Table 3 Accent 3" w:uiPriority="48"/>
+    <w:lsdException w:name="Grid Table 4 Accent 3" w:uiPriority="49"/>
+    <w:lsdException w:name="Grid Table 5 Dark Accent 3" w:uiPriority="50"/>
+    <w:lsdException w:name="Grid Table 6 Colorful Accent 3" w:uiPriority="51"/>
+    <w:lsdException w:name="Grid Table 7 Colorful Accent 3" w:uiPriority="52"/>
+    <w:lsdException w:name="Grid Table 1 Light Accent 4" w:uiPriority="46"/>
+    <w:lsdException w:name="Grid Table 2 Accent 4" w:uiPriority="47"/>
+    <w:lsdException w:name="Grid Table 3 Accent 4" w:uiPriority="48"/>
+    <w:lsdException w:name="Grid Table 4 Accent 4" w:uiPriority="49"/>
+    <w:lsdException w:name="Grid Table 5 Dark Accent 4" w:uiPriority="50"/>
+    <w:lsdException w:name="Grid Table 6 Colorful Accent 4" w:uiPriority="51"/>
+    <w:lsdException w:name="Grid Table 7 Colorful Accent 4" w:uiPriority="52"/>
+    <w:lsdException w:name="Grid Table 1 Light Accent 5" w:uiPriority="46"/>
+    <w:lsdException w:name="Grid Table 2 Accent 5" w:uiPriority="47"/>
+    <w:lsdException w:name="Grid Table 3 Accent 5" w:uiPriority="48"/>
+    <w:lsdException w:name="Grid Table 4 Accent 5" w:uiPriority="49"/>
+    <w:lsdException w:name="Grid Table 5 Dark Accent 5" w:uiPriority="50"/>
+    <w:lsdException w:name="Grid Table 6 Colorful Accent 5" w:uiPriority="51"/>
+    <w:lsdException w:name="Grid Table 7 Colorful Accent 5" w:uiPriority="52"/>
+    <w:lsdException w:name="Grid Table 1 Light Accent 6" w:uiPriority="46"/>
+    <w:lsdException w:name="Grid Table 2 Accent 6" w:uiPriority="47"/>
+    <w:lsdException w:name="Grid Table 3 Accent 6" w:uiPriority="48"/>
+    <w:lsdException w:name="Grid Table 4 Accent 6" w:uiPriority="49"/>
+    <w:lsdException w:name="Grid Table 5 Dark Accent 6" w:uiPriority="50"/>
+    <w:lsdException w:name="Grid Table 6 Colorful Accent 6" w:uiPriority="51"/>
+    <w:lsdException w:name="Grid Table 7 Colorful Accent 6" w:uiPriority="52"/>
+    <w:lsdException w:name="List Table 1 Light" w:uiPriority="46"/>
+    <w:lsdException w:name="List Table 2" w:uiPriority="47"/>
+    <w:lsdException w:name="List Table 3" w:uiPriority="48"/>
+    <w:lsdException w:name="List Table 4" w:uiPriority="49"/>
+    <w:lsdException w:name="List Table 5 Dark" w:uiPriority="50"/>
+    <w:lsdException w:name="List Table 6 Colorful" w:uiPriority="51"/>
+    <w:lsdException w:name="List Table 7 Colorful" w:uiPriority="52"/>
+    <w:lsdException w:name="List Table 1 Light Accent 1" w:uiPriority="46"/>
+    <w:lsdException w:name="List Table 2 Accent 1" w:uiPriority="47"/>
+    <w:lsdException w:name="List Table 3 Accent 1" w:uiPriority="48"/>
+    <w:lsdException w:name="List Table 4 Accent 1" w:uiPriority="49"/>
+    <w:lsdException w:name="List Table 5 Dark Accent 1" w:uiPriority="50"/>
+    <w:lsdException w:name="List Table 6 Colorful Accent 1" w:uiPriority="51"/>
+    <w:lsdException w:name="List Table 7 Colorful Accent 1" w:uiPriority="52"/>
+    <w:lsdException w:name="List Table 1 Light Accent 2" w:uiPriority="46"/>
+    <w:lsdException w:name="List Table 2 Accent 2" w:uiPriority="47"/>
+    <w:lsdException w:name="List Table 3 Accent 2" w:uiPriority="48"/>
+    <w:lsdException w:name="List Table 4 Accent 2" w:uiPriority="49"/>
+    <w:lsdException w:name="List Table 5 Dark Accent 2" w:uiPriority="50"/>
+    <w:lsdException w:name="List Table 6 Colorful Accent 2" w:uiPriority="51"/>
+    <w:lsdException w:name="List Table 7 Colorful Accent 2" w:uiPriority="52"/>
+    <w:lsdException w:name="List Table 1 Light Accent 3" w:uiPriority="46"/>
+    <w:lsdException w:name="List Table 2 Accent 3" w:uiPriority="47"/>
+    <w:lsdException w:name="List Table 3 Accent 3" w:uiPriority="48"/>
+    <w:lsdException w:name="List Table 4 Accent 3" w:uiPriority="49"/>
+    <w:lsdException w:name="List Table 5 Dark Accent 3" w:uiPriority="50"/>
+    <w:lsdException w:name="List Table 6 Colorful Accent 3" w:uiPriority="51"/>
+    <w:lsdException w:name="List Table 7 Colorful Accent 3" w:uiPriority="52"/>
+    <w:lsdException w:name="List Table 1 Light Accent 4" w:uiPriority="46"/>
+    <w:lsdException w:name="List Table 2 Accent 4" w:uiPriority="47"/>
+    <w:lsdException w:name="List Table 3 Accent 4" w:uiPriority="48"/>
+    <w:lsdException w:name="List Table 4 Accent 4" w:uiPriority="49"/>
+    <w:lsdException w:name="List Table 5 Dark Accent 4" w:uiPriority="50"/>
+    <w:lsdException w:name="List Table 6 Colorful Accent 4" w:uiPriority="51"/>
+    <w:lsdException w:name="List Table 7 Colorful Accent 4" w:uiPriority="52"/>
+    <w:lsdException w:name="List Table 1 Light Accent 5" w:uiPriority="46"/>
+    <w:lsdException w:name="List Table 2 Accent 5" w:uiPriority="47"/>
+    <w:lsdException w:name="List Table 3 Accent 5" w:uiPriority="48"/>
+    <w:lsdException w:name="List Table 4 Accent 5" w:uiPriority="49"/>
+    <w:lsdException w:name="List Table 5 Dark Accent 5" w:uiPriority="50"/>
+    <w:lsdException w:name="List Table 6 Colorful Accent 5" w:uiPriority="51"/>
+    <w:lsdException w:name="List Table 7 Colorful Accent 5" w:uiPriority="52"/>
+    <w:lsdException w:name="List Table 1 Light Accent 6" w:uiPriority="46"/>
+    <w:lsdException w:name="List Table 2 Accent 6" w:uiPriority="47"/>
+    <w:lsdException w:name="List Table 3 Accent 6" w:uiPriority="48"/>
+    <w:lsdException w:name="List Table 4 Accent 6" w:uiPriority="49"/>
+    <w:lsdException w:name="List Table 5 Dark Accent 6" w:uiPriority="50"/>
+    <w:lsdException w:name="List Table 6 Colorful Accent 6" w:uiPriority="51"/>
+    <w:lsdException w:name="List Table 7 Colorful Accent 6" w:uiPriority="52"/>
+    <w:lsdException w:name="Mention" w:semiHidden="1" w:unhideWhenUsed="1"/>
+    <w:lsdException w:name="Smart Hyperlink" w:semiHidden="1" w:unhideWhenUsed="1"/>
+    <w:lsdException w:name="Hashtag" w:semiHidden="1" w:unhideWhenUsed="1"/>
+    <w:lsdException w:name="Unresolved Mention" w:semiHidden="1" w:unhideWhenUsed="1"/>
+  </w:latentStyles>
+  <w:style w:type="paragraph" w:default="1" w:styleId="Normal">
+    <w:name w:val="Normal"/>
     <w:qFormat/>
     <w:rPr>
-      <w:sz w:val="56"/>
-      <w:szCs w:val="56"/>
+      <w:rFonts w:cs="Mangal"/>
     </w:rPr>
   </w:style>
   <w:style w:type="paragraph" w:styleId="Heading1">
-    <w:name w:val="Heading 1"/>
-    <w:basedOn w:val="Normal"/>
-    <w:next w:val="Normal"/>
+    <w:name w:val="heading 1"/>
+    <w:uiPriority w:val="9"/>
     <w:qFormat/>
+    <w:pPr>
+      <w:outlineLvl w:val="0"/>
+    </w:pPr>
     <w:rPr>
       <w:color w:val="2E74B5"/>
       <w:sz w:val="32"/>
@@ -1736,10 +2488,14 @@
     </w:rPr>
   </w:style>
   <w:style w:type="paragraph" w:styleId="Heading2">
-    <w:name w:val="Heading 2"/>
-    <w:basedOn w:val="Normal"/>
-    <w:next w:val="Normal"/>
+    <w:name w:val="heading 2"/>
+    <w:uiPriority w:val="9"/>
+    <w:semiHidden/>
+    <w:unhideWhenUsed/>
     <w:qFormat/>
+    <w:pPr>
+      <w:outlineLvl w:val="1"/>
+    </w:pPr>
     <w:rPr>
       <w:color w:val="2E74B5"/>
       <w:sz w:val="26"/>
@@ -1747,10 +2503,14 @@
     </w:rPr>
   </w:style>
   <w:style w:type="paragraph" w:styleId="Heading3">
-    <w:name w:val="Heading 3"/>
-    <w:basedOn w:val="Normal"/>
-    <w:next w:val="Normal"/>
+    <w:name w:val="heading 3"/>
+    <w:uiPriority w:val="9"/>
+    <w:semiHidden/>
+    <w:unhideWhenUsed/>
     <w:qFormat/>
+    <w:pPr>
+      <w:outlineLvl w:val="2"/>
+    </w:pPr>
     <w:rPr>
       <w:color w:val="1F4D78"/>
       <w:sz w:val="24"/>
@@ -1758,10 +2518,14 @@
     </w:rPr>
   </w:style>
   <w:style w:type="paragraph" w:styleId="Heading4">
-    <w:name w:val="Heading 4"/>
-    <w:basedOn w:val="Normal"/>
-    <w:next w:val="Normal"/>
+    <w:name w:val="heading 4"/>
+    <w:uiPriority w:val="9"/>
+    <w:semiHidden/>
+    <w:unhideWhenUsed/>
     <w:qFormat/>
+    <w:pPr>
+      <w:outlineLvl w:val="3"/>
+    </w:pPr>
     <w:rPr>
       <w:i/>
       <w:iCs/>
@@ -1769,27 +2533,69 @@
     </w:rPr>
   </w:style>
   <w:style w:type="paragraph" w:styleId="Heading5">
-    <w:name w:val="Heading 5"/>
-    <w:basedOn w:val="Normal"/>
-    <w:next w:val="Normal"/>
+    <w:name w:val="heading 5"/>
+    <w:uiPriority w:val="9"/>
+    <w:semiHidden/>
+    <w:unhideWhenUsed/>
     <w:qFormat/>
+    <w:pPr>
+      <w:outlineLvl w:val="4"/>
+    </w:pPr>
     <w:rPr>
       <w:color w:val="2E74B5"/>
     </w:rPr>
   </w:style>
   <w:style w:type="paragraph" w:styleId="Heading6">
-    <w:name w:val="Heading 6"/>
-    <w:basedOn w:val="Normal"/>
-    <w:next w:val="Normal"/>
+    <w:name w:val="heading 6"/>
+    <w:uiPriority w:val="9"/>
+    <w:semiHidden/>
+    <w:unhideWhenUsed/>
     <w:qFormat/>
+    <w:pPr>
+      <w:outlineLvl w:val="5"/>
+    </w:pPr>
     <w:rPr>
       <w:color w:val="1F4D78"/>
     </w:rPr>
   </w:style>
-  <w:style w:type="paragraph" w:styleId="Strong">
-    <w:name w:val="Strong"/>
-    <w:basedOn w:val="Normal"/>
-    <w:next w:val="Normal"/>
+  <w:style w:type="character" w:default="1" w:styleId="DefaultParagraphFont">
+    <w:name w:val="Default Paragraph Font"/>
+    <w:uiPriority w:val="1"/>
+    <w:semiHidden/>
+    <w:unhideWhenUsed/>
+  </w:style>
+  <w:style w:type="table" w:default="1" w:styleId="TableNormal">
+    <w:name w:val="Normal Table"/>
+    <w:uiPriority w:val="99"/>
+    <w:semiHidden/>
+    <w:unhideWhenUsed/>
+    <w:tblPr>
+      <w:tblInd w:w="0" w:type="dxa"/>
+      <w:tblCellMar>
+        <w:top w:w="0" w:type="dxa"/>
+        <w:left w:w="108" w:type="dxa"/>
+        <w:bottom w:w="0" w:type="dxa"/>
+        <w:right w:w="108" w:type="dxa"/>
+      </w:tblCellMar>
+    </w:tblPr>
+  </w:style>
+  <w:style w:type="numbering" w:default="1" w:styleId="NoList">
+    <w:name w:val="No List"/>
+    <w:uiPriority w:val="99"/>
+    <w:semiHidden/>
+    <w:unhideWhenUsed/>
+  </w:style>
+  <w:style w:type="paragraph" w:styleId="Title">
+    <w:name w:val="Title"/>
+    <w:uiPriority w:val="10"/>
+    <w:qFormat/>
+    <w:rPr>
+      <w:sz w:val="56"/>
+      <w:szCs w:val="56"/>
+    </w:rPr>
+  </w:style>
+  <w:style w:type="paragraph" w:customStyle="1" w:styleId="Strong1">
+    <w:name w:val="Strong1"/>
     <w:qFormat/>
     <w:rPr>
       <w:b/>
@@ -1798,12 +2604,10 @@
   </w:style>
   <w:style w:type="paragraph" w:styleId="ListParagraph">
     <w:name w:val="List Paragraph"/>
-    <w:basedOn w:val="Normal"/>
     <w:qFormat/>
   </w:style>
   <w:style w:type="character" w:styleId="Hyperlink">
     <w:name w:val="Hyperlink"/>
-    <w:basedOn w:val="DefaultParagraphFont"/>
     <w:uiPriority w:val="99"/>
     <w:unhideWhenUsed/>
     <w:rPr>
@@ -1813,7 +2617,6 @@
   </w:style>
   <w:style w:type="character" w:styleId="FootnoteReference">
     <w:name w:val="footnote reference"/>
-    <w:basedOn w:val="DefaultParagraphFont"/>
     <w:uiPriority w:val="99"/>
     <w:semiHidden/>
     <w:unhideWhenUsed/>
@@ -1823,22 +2626,13 @@
   </w:style>
   <w:style w:type="paragraph" w:styleId="FootnoteText">
     <w:name w:val="footnote text"/>
-    <w:basedOn w:val="Normal"/>
     <w:link w:val="FootnoteTextChar"/>
     <w:uiPriority w:val="99"/>
     <w:semiHidden/>
     <w:unhideWhenUsed/>
-    <w:pPr>
-      <w:spacing w:after="0" w:line="240" w:lineRule="auto"/>
-    </w:pPr>
-    <w:rPr>
-      <w:sz w:val="20"/>
-      <w:szCs w:val="20"/>
-    </w:rPr>
   </w:style>
-  <w:style w:type="character" w:styleId="FootnoteTextChar">
+  <w:style w:type="character" w:customStyle="1" w:styleId="FootnoteTextChar">
     <w:name w:val="Footnote Text Char"/>
-    <w:basedOn w:val="DefaultParagraphFont"/>
     <w:link w:val="FootnoteText"/>
     <w:uiPriority w:val="99"/>
     <w:semiHidden/>
@@ -1850,7 +2644,6 @@
   </w:style>
   <w:style w:type="character" w:styleId="EndnoteReference">
     <w:name w:val="endnote reference"/>
-    <w:basedOn w:val="DefaultParagraphFont"/>
     <w:uiPriority w:val="99"/>
     <w:semiHidden/>
     <w:unhideWhenUsed/>
@@ -1860,22 +2653,13 @@
   </w:style>
   <w:style w:type="paragraph" w:styleId="EndnoteText">
     <w:name w:val="endnote text"/>
-    <w:basedOn w:val="Normal"/>
     <w:link w:val="EndnoteTextChar"/>
     <w:uiPriority w:val="99"/>
     <w:semiHidden/>
     <w:unhideWhenUsed/>
-    <w:pPr>
-      <w:spacing w:after="0" w:line="240" w:lineRule="auto"/>
-    </w:pPr>
-    <w:rPr>
-      <w:sz w:val="20"/>
-      <w:szCs w:val="20"/>
-    </w:rPr>
   </w:style>
-  <w:style w:type="character" w:styleId="EndnoteTextChar">
+  <w:style w:type="character" w:customStyle="1" w:styleId="EndnoteTextChar">
     <w:name w:val="Endnote Text Char"/>
-    <w:basedOn w:val="DefaultParagraphFont"/>
     <w:link w:val="EndnoteText"/>
     <w:uiPriority w:val="99"/>
     <w:semiHidden/>
@@ -1886,4 +2670,299 @@
     </w:rPr>
   </w:style>
 </w:styles>
+</file>
+
+<file path=word/theme/theme1.xml><?xml version="1.0" encoding="utf-8"?>
+<a:theme xmlns:a="http://schemas.openxmlformats.org/drawingml/2006/main" name="Office Theme">
+  <a:themeElements>
+    <a:clrScheme name="Office">
+      <a:dk1>
+        <a:sysClr val="windowText" lastClr="000000"/>
+      </a:dk1>
+      <a:lt1>
+        <a:sysClr val="window" lastClr="FFFFFF"/>
+      </a:lt1>
+      <a:dk2>
+        <a:srgbClr val="44546A"/>
+      </a:dk2>
+      <a:lt2>
+        <a:srgbClr val="E7E6E6"/>
+      </a:lt2>
+      <a:accent1>
+        <a:srgbClr val="4472C4"/>
+      </a:accent1>
+      <a:accent2>
+        <a:srgbClr val="ED7D31"/>
+      </a:accent2>
+      <a:accent3>
+        <a:srgbClr val="A5A5A5"/>
+      </a:accent3>
+      <a:accent4>
+        <a:srgbClr val="FFC000"/>
+      </a:accent4>
+      <a:accent5>
+        <a:srgbClr val="5B9BD5"/>
+      </a:accent5>
+      <a:accent6>
+        <a:srgbClr val="70AD47"/>
+      </a:accent6>
+      <a:hlink>
+        <a:srgbClr val="0563C1"/>
+      </a:hlink>
+      <a:folHlink>
+        <a:srgbClr val="954F72"/>
+      </a:folHlink>
+    </a:clrScheme>
+    <a:fontScheme name="Office">
+      <a:majorFont>
+        <a:latin typeface="Calibri Light" panose="020F0302020204030204"/>
+        <a:ea typeface=""/>
+        <a:cs typeface=""/>
+        <a:font script="Jpan" typeface="游ゴシック Light"/>
+        <a:font script="Hang" typeface="맑은 고딕"/>
+        <a:font script="Hans" typeface="等线 Light"/>
+        <a:font script="Hant" typeface="新細明體"/>
+        <a:font script="Arab" typeface="Times New Roman"/>
+        <a:font script="Hebr" typeface="Times New Roman"/>
+        <a:font script="Thai" typeface="Angsana New"/>
+        <a:font script="Ethi" typeface="Nyala"/>
+        <a:font script="Beng" typeface="Vrinda"/>
+        <a:font script="Gujr" typeface="Shruti"/>
+        <a:font script="Khmr" typeface="MoolBoran"/>
+        <a:font script="Knda" typeface="Tunga"/>
+        <a:font script="Guru" typeface="Raavi"/>
+        <a:font script="Cans" typeface="Euphemia"/>
+        <a:font script="Cher" typeface="Plantagenet Cherokee"/>
+        <a:font script="Yiii" typeface="Microsoft Yi Baiti"/>
+        <a:font script="Tibt" typeface="Microsoft Himalaya"/>
+        <a:font script="Thaa" typeface="MV Boli"/>
+        <a:font script="Deva" typeface="Mangal"/>
+        <a:font script="Telu" typeface="Gautami"/>
+        <a:font script="Taml" typeface="Latha"/>
+        <a:font script="Syrc" typeface="Estrangelo Edessa"/>
+        <a:font script="Orya" typeface="Kalinga"/>
+        <a:font script="Mlym" typeface="Kartika"/>
+        <a:font script="Laoo" typeface="DokChampa"/>
+        <a:font script="Sinh" typeface="Iskoola Pota"/>
+        <a:font script="Mong" typeface="Mongolian Baiti"/>
+        <a:font script="Viet" typeface="Times New Roman"/>
+        <a:font script="Uigh" typeface="Microsoft Uighur"/>
+        <a:font script="Geor" typeface="Sylfaen"/>
+        <a:font script="Armn" typeface="Arial"/>
+        <a:font script="Bugi" typeface="Leelawadee UI"/>
+        <a:font script="Bopo" typeface="Microsoft JhengHei"/>
+        <a:font script="Java" typeface="Javanese Text"/>
+        <a:font script="Lisu" typeface="Segoe UI"/>
+        <a:font script="Mymr" typeface="Myanmar Text"/>
+        <a:font script="Nkoo" typeface="Ebrima"/>
+        <a:font script="Olck" typeface="Nirmala UI"/>
+        <a:font script="Osma" typeface="Ebrima"/>
+        <a:font script="Phag" typeface="Phagspa"/>
+        <a:font script="Syrn" typeface="Estrangelo Edessa"/>
+        <a:font script="Syrj" typeface="Estrangelo Edessa"/>
+        <a:font script="Syre" typeface="Estrangelo Edessa"/>
+        <a:font script="Sora" typeface="Nirmala UI"/>
+        <a:font script="Tale" typeface="Microsoft Tai Le"/>
+        <a:font script="Talu" typeface="Microsoft New Tai Lue"/>
+        <a:font script="Tfng" typeface="Ebrima"/>
+      </a:majorFont>
+      <a:minorFont>
+        <a:latin typeface="Calibri" panose="020F0502020204030204"/>
+        <a:ea typeface=""/>
+        <a:cs typeface=""/>
+        <a:font script="Jpan" typeface="游明朝"/>
+        <a:font script="Hang" typeface="맑은 고딕"/>
+        <a:font script="Hans" typeface="等线"/>
+        <a:font script="Hant" typeface="新細明體"/>
+        <a:font script="Arab" typeface="Arial"/>
+        <a:font script="Hebr" typeface="Arial"/>
+        <a:font script="Thai" typeface="Cordia New"/>
+        <a:font script="Ethi" typeface="Nyala"/>
+        <a:font script="Beng" typeface="Vrinda"/>
+        <a:font script="Gujr" typeface="Shruti"/>
+        <a:font script="Khmr" typeface="DaunPenh"/>
+        <a:font script="Knda" typeface="Tunga"/>
+        <a:font script="Guru" typeface="Raavi"/>
+        <a:font script="Cans" typeface="Euphemia"/>
+        <a:font script="Cher" typeface="Plantagenet Cherokee"/>
+        <a:font script="Yiii" typeface="Microsoft Yi Baiti"/>
+        <a:font script="Tibt" typeface="Microsoft Himalaya"/>
+        <a:font script="Thaa" typeface="MV Boli"/>
+        <a:font script="Deva" typeface="Mangal"/>
+        <a:font script="Telu" typeface="Gautami"/>
+        <a:font script="Taml" typeface="Latha"/>
+        <a:font script="Syrc" typeface="Estrangelo Edessa"/>
+        <a:font script="Orya" typeface="Kalinga"/>
+        <a:font script="Mlym" typeface="Kartika"/>
+        <a:font script="Laoo" typeface="DokChampa"/>
+        <a:font script="Sinh" typeface="Iskoola Pota"/>
+        <a:font script="Mong" typeface="Mongolian Baiti"/>
+        <a:font script="Viet" typeface="Arial"/>
+        <a:font script="Uigh" typeface="Microsoft Uighur"/>
+        <a:font script="Geor" typeface="Sylfaen"/>
+        <a:font script="Armn" typeface="Arial"/>
+        <a:font script="Bugi" typeface="Leelawadee UI"/>
+        <a:font script="Bopo" typeface="Microsoft JhengHei"/>
+        <a:font script="Java" typeface="Javanese Text"/>
+        <a:font script="Lisu" typeface="Segoe UI"/>
+        <a:font script="Mymr" typeface="Myanmar Text"/>
+        <a:font script="Nkoo" typeface="Ebrima"/>
+        <a:font script="Olck" typeface="Nirmala UI"/>
+        <a:font script="Osma" typeface="Ebrima"/>
+        <a:font script="Phag" typeface="Phagspa"/>
+        <a:font script="Syrn" typeface="Estrangelo Edessa"/>
+        <a:font script="Syrj" typeface="Estrangelo Edessa"/>
+        <a:font script="Syre" typeface="Estrangelo Edessa"/>
+        <a:font script="Sora" typeface="Nirmala UI"/>
+        <a:font script="Tale" typeface="Microsoft Tai Le"/>
+        <a:font script="Talu" typeface="Microsoft New Tai Lue"/>
+        <a:font script="Tfng" typeface="Ebrima"/>
+      </a:minorFont>
+    </a:fontScheme>
+    <a:fmtScheme name="Office">
+      <a:fillStyleLst>
+        <a:solidFill>
+          <a:schemeClr val="phClr"/>
+        </a:solidFill>
+        <a:gradFill rotWithShape="1">
+          <a:gsLst>
+            <a:gs pos="0">
+              <a:schemeClr val="phClr">
+                <a:lumMod val="110000"/>
+                <a:satMod val="105000"/>
+                <a:tint val="67000"/>
+              </a:schemeClr>
+            </a:gs>
+            <a:gs pos="50000">
+              <a:schemeClr val="phClr">
+                <a:lumMod val="105000"/>
+                <a:satMod val="103000"/>
+                <a:tint val="73000"/>
+              </a:schemeClr>
+            </a:gs>
+            <a:gs pos="100000">
+              <a:schemeClr val="phClr">
+                <a:lumMod val="105000"/>
+                <a:satMod val="109000"/>
+                <a:tint val="81000"/>
+              </a:schemeClr>
+            </a:gs>
+          </a:gsLst>
+          <a:lin ang="5400000" scaled="0"/>
+        </a:gradFill>
+        <a:gradFill rotWithShape="1">
+          <a:gsLst>
+            <a:gs pos="0">
+              <a:schemeClr val="phClr">
+                <a:satMod val="103000"/>
+                <a:lumMod val="102000"/>
+                <a:tint val="94000"/>
+              </a:schemeClr>
+            </a:gs>
+            <a:gs pos="50000">
+              <a:schemeClr val="phClr">
+                <a:satMod val="110000"/>
+                <a:lumMod val="100000"/>
+                <a:shade val="100000"/>
+              </a:schemeClr>
+            </a:gs>
+            <a:gs pos="100000">
+              <a:schemeClr val="phClr">
+                <a:lumMod val="99000"/>
+                <a:satMod val="120000"/>
+                <a:shade val="78000"/>
+              </a:schemeClr>
+            </a:gs>
+          </a:gsLst>
+          <a:lin ang="5400000" scaled="0"/>
+        </a:gradFill>
+      </a:fillStyleLst>
+      <a:lnStyleLst>
+        <a:ln w="6350" cap="flat" cmpd="sng" algn="ctr">
+          <a:solidFill>
+            <a:schemeClr val="phClr"/>
+          </a:solidFill>
+          <a:prstDash val="solid"/>
+          <a:miter lim="800000"/>
+        </a:ln>
+        <a:ln w="12700" cap="flat" cmpd="sng" algn="ctr">
+          <a:solidFill>
+            <a:schemeClr val="phClr"/>
+          </a:solidFill>
+          <a:prstDash val="solid"/>
+          <a:miter lim="800000"/>
+        </a:ln>
+        <a:ln w="19050" cap="flat" cmpd="sng" algn="ctr">
+          <a:solidFill>
+            <a:schemeClr val="phClr"/>
+          </a:solidFill>
+          <a:prstDash val="solid"/>
+          <a:miter lim="800000"/>
+        </a:ln>
+      </a:lnStyleLst>
+      <a:effectStyleLst>
+        <a:effectStyle>
+          <a:effectLst/>
+        </a:effectStyle>
+        <a:effectStyle>
+          <a:effectLst/>
+        </a:effectStyle>
+        <a:effectStyle>
+          <a:effectLst>
+            <a:outerShdw blurRad="57150" dist="19050" dir="5400000" algn="ctr" rotWithShape="0">
+              <a:srgbClr val="000000">
+                <a:alpha val="63000"/>
+              </a:srgbClr>
+            </a:outerShdw>
+          </a:effectLst>
+        </a:effectStyle>
+      </a:effectStyleLst>
+      <a:bgFillStyleLst>
+        <a:solidFill>
+          <a:schemeClr val="phClr"/>
+        </a:solidFill>
+        <a:solidFill>
+          <a:schemeClr val="phClr">
+            <a:tint val="95000"/>
+            <a:satMod val="170000"/>
+          </a:schemeClr>
+        </a:solidFill>
+        <a:gradFill rotWithShape="1">
+          <a:gsLst>
+            <a:gs pos="0">
+              <a:schemeClr val="phClr">
+                <a:tint val="93000"/>
+                <a:satMod val="150000"/>
+                <a:shade val="98000"/>
+                <a:lumMod val="102000"/>
+              </a:schemeClr>
+            </a:gs>
+            <a:gs pos="50000">
+              <a:schemeClr val="phClr">
+                <a:tint val="98000"/>
+                <a:satMod val="130000"/>
+                <a:shade val="90000"/>
+                <a:lumMod val="103000"/>
+              </a:schemeClr>
+            </a:gs>
+            <a:gs pos="100000">
+              <a:schemeClr val="phClr">
+                <a:shade val="63000"/>
+                <a:satMod val="120000"/>
+              </a:schemeClr>
+            </a:gs>
+          </a:gsLst>
+          <a:lin ang="5400000" scaled="0"/>
+        </a:gradFill>
+      </a:bgFillStyleLst>
+    </a:fmtScheme>
+  </a:themeElements>
+  <a:objectDefaults/>
+  <a:extraClrSchemeLst/>
+  <a:extLst>
+    <a:ext uri="{05A4C25C-085E-4340-85A3-A5531E510DB2}">
+      <thm15:themeFamily xmlns:thm15="http://schemas.microsoft.com/office/thememl/2012/main" name="Office Theme" id="{62F939B6-93AF-4DB8-9C6B-D6C7DFDC589F}" vid="{4A3C46E8-61CC-4603-A589-7422A47A8E4A}"/>
+    </a:ext>
+  </a:extLst>
+</a:theme>
 </file>
</xml_diff>